<commit_message>
Update The Ripple Effect - BUSINESS CASE.docx
</commit_message>
<xml_diff>
--- a/Documentation/The Ripple Effect - BUSINESS CASE.docx
+++ b/Documentation/The Ripple Effect - BUSINESS CASE.docx
@@ -1467,11 +1467,34 @@
         <w:t xml:space="preserve">. Research in Cape Town reveals that household water use is highly unequal, with the wealthiest +/-14% of residents consuming over half of the municipal water, much of it for non-essential purposes such as filling pools and irrigating gardens </w:t>
       </w:r>
       <w:r>
+        <w:t xml:space="preserve">(Savelli, 2023, as reported by </w:t>
+      </w:r>
+      <w:r>
         <w:rPr>
           <w:i/>
           <w:iCs/>
         </w:rPr>
-        <w:t>(Savelli, 2023).</w:t>
+        <w:t>The Washington Post</w:t>
+      </w:r>
+      <w:r>
+        <w:t xml:space="preserve"> and </w:t>
+      </w:r>
+      <w:r>
+        <w:rPr>
+          <w:i/>
+          <w:iCs/>
+        </w:rPr>
+        <w:t>The Guardian</w:t>
+      </w:r>
+      <w:r>
+        <w:t>)</w:t>
+      </w:r>
+      <w:r>
+        <w:rPr>
+          <w:i/>
+          <w:iCs/>
+        </w:rPr>
+        <w:t>.</w:t>
       </w:r>
       <w:r>
         <w:t xml:space="preserve"> </w:t>
@@ -1569,16 +1592,47 @@
     <w:p>
       <w:pPr>
         <w:spacing w:after="200" w:line="276" w:lineRule="auto"/>
+        <w:rPr>
+          <w:i/>
+          <w:iCs/>
+        </w:rPr>
       </w:pPr>
       <w:r>
         <w:t xml:space="preserve">Unreliable electricity is a challenge in South Africa. Load shedding interrupts pool pump schedules, which affects water circulation and disinfection. This can cause algae to grow and strain equipment when the power comes back. Pool pumps also use a lot of electricity. Each pump uses about 2,600 kWh per year, adding up to around 1.84 TWh nationwide. </w:t>
       </w:r>
       <w:r>
+        <w:t>(</w:t>
+      </w:r>
+      <w:r>
         <w:rPr>
           <w:i/>
           <w:iCs/>
         </w:rPr>
-        <w:t>("</w:t>
+        <w:t>Wuppertal Institute, 2015</w:t>
+      </w:r>
+      <w:r>
+        <w:rPr>
+          <w:i/>
+          <w:iCs/>
+        </w:rPr>
+        <w:t>)</w:t>
+      </w:r>
+      <w:r>
+        <w:rPr>
+          <w:i/>
+          <w:iCs/>
+        </w:rPr>
+        <w:t xml:space="preserve">. </w:t>
+      </w:r>
+      <w:r>
+        <w:t xml:space="preserve"> Making pumps more efficient can save money and ease pressure on the power grid. Load shedding also reduces chemical distribution, allowing contaminants to accumulate. If pumps are not restarted promptly or properly after power is restored, water quality deteriorates, increasing the risk of pathogen growth such as E. coli and Cryptosporidium, which are harmful to swimmers </w:t>
+      </w:r>
+      <w:r>
+        <w:rPr>
+          <w:i/>
+          <w:iCs/>
+        </w:rPr>
+        <w:t>(</w:t>
       </w:r>
       <w:proofErr w:type="spellStart"/>
       <w:r>
@@ -1586,7 +1640,7 @@
           <w:i/>
           <w:iCs/>
         </w:rPr>
-        <w:t>bigEE</w:t>
+        <w:t>Centers</w:t>
       </w:r>
       <w:proofErr w:type="spellEnd"/>
       <w:r>
@@ -1594,42 +1648,67 @@
           <w:i/>
           <w:iCs/>
         </w:rPr>
-        <w:t xml:space="preserve"> Countries: South Africa - Appliances", 2015)</w:t>
-      </w:r>
-      <w:r>
-        <w:t xml:space="preserve"> Making pumps more efficient can save money and ease pressure on the power grid. Load shedding also reduces chemical distribution, allowing contaminants to accumulate. If pumps are not restarted promptly or properly after power is restored, water quality deteriorates, increasing the risk of pathogen growth such as E. coli and Cryptosporidium, which are harmful to swimmers </w:t>
+        <w:t xml:space="preserve"> for Disease Control and Prevention</w:t>
       </w:r>
       <w:r>
         <w:rPr>
           <w:i/>
           <w:iCs/>
         </w:rPr>
-        <w:t>(CDC, 2024).</w:t>
-      </w:r>
-      <w:r>
-        <w:t xml:space="preserve"> </w:t>
+        <w:t xml:space="preserve">, </w:t>
+      </w:r>
+      <w:r>
+        <w:rPr>
+          <w:i/>
+          <w:iCs/>
+        </w:rPr>
+        <w:t>2024</w:t>
+      </w:r>
+      <w:r>
+        <w:rPr>
+          <w:i/>
+          <w:iCs/>
+        </w:rPr>
+        <w:t xml:space="preserve">). </w:t>
       </w:r>
     </w:p>
     <w:p>
       <w:pPr>
         <w:spacing w:after="200" w:line="276" w:lineRule="auto"/>
-      </w:pPr>
-      <w:r>
-        <w:t xml:space="preserve">The health and safety dimension requires a disciplined approach to water chemistry. International public-health guidance, used globally by operators and many residential guides, recommends maintaining free chlorine at 1-2+ ppm depending on cyanuric acid and </w:t>
+        <w:rPr>
+          <w:i/>
+          <w:iCs/>
+        </w:rPr>
+      </w:pPr>
+      <w:r>
+        <w:t xml:space="preserve">The health and safety dimension requires a disciplined approach to water chemistry. International public-health guidance, used globally by operators and many residential </w:t>
       </w:r>
       <w:r>
         <w:lastRenderedPageBreak/>
-        <w:t xml:space="preserve">pH between 7.0-7.8 to control pathogens and protect bathers and equipment, reinforcing the value of guided testing, calculators, and reminders for non-expert users </w:t>
+        <w:t xml:space="preserve">guides, recommends maintaining free chlorine at 1-2+ ppm depending on cyanuric acid and pH between 7.0-7.8 to control pathogens and protect bathers and equipment, reinforcing the value of guided testing, calculators, and reminders for non-expert users </w:t>
       </w:r>
       <w:r>
         <w:rPr>
           <w:i/>
           <w:iCs/>
         </w:rPr>
-        <w:t>(CDC, 2024).</w:t>
-      </w:r>
-      <w:r>
-        <w:t xml:space="preserve"> </w:t>
+        <w:t>(</w:t>
+      </w:r>
+      <w:proofErr w:type="spellStart"/>
+      <w:r>
+        <w:rPr>
+          <w:i/>
+          <w:iCs/>
+        </w:rPr>
+        <w:t>Centers</w:t>
+      </w:r>
+      <w:proofErr w:type="spellEnd"/>
+      <w:r>
+        <w:rPr>
+          <w:i/>
+          <w:iCs/>
+        </w:rPr>
+        <w:t xml:space="preserve"> for Disease Control and Prevention, 2024). </w:t>
       </w:r>
     </w:p>
     <w:p>
@@ -1693,8 +1772,13 @@
         <w:spacing w:after="200" w:line="276" w:lineRule="auto"/>
       </w:pPr>
       <w:r>
-        <w:t>The problem is not that there aren’t enough pool maintenance options, but that they are spread out. In South Africa, there isn’t one platform that covers everything, from DIY water testing and advice to booking trusted service providers. A digital, all-in-one solution would help homeowners track chemical levels, plan maintenance, and book professionals easily. For businesses, it would provide a clear marketplace, help them find more customers, and make managing work and supplies simpler.</w:t>
-      </w:r>
+        <w:t xml:space="preserve">The problem is not that there aren’t enough pool maintenance options, but that they are spread out. In South Africa, </w:t>
+      </w:r>
+      <w:bookmarkStart w:id="0" w:name="_Hlk207023184"/>
+      <w:r>
+        <w:t>there isn’t one platform that covers everything, from DIY water testing and advice to booking trusted service providers. A digital, all-in-one solution would help homeowners track chemical levels, plan maintenance, and book professionals easily. For businesses, it would provide a clear marketplace, help them find more customers, and make managing work and supplies simpler.</w:t>
+      </w:r>
+      <w:bookmarkEnd w:id="0"/>
     </w:p>
     <w:p>
       <w:pPr>
@@ -1705,11 +1789,11 @@
         </w:rPr>
       </w:pPr>
       <w:r>
-        <w:t xml:space="preserve">By combining these elements, such a system could address multiple local challenges simultaneously, including reducing water and chemical waste, lowering operational costs, improving compliance with municipal regulations, and ensuring consistent, reliable service. This aligns with global trends in digital service marketplaces, which demonstrate that </w:t>
+        <w:t xml:space="preserve">By combining these elements, such a system could address multiple local challenges simultaneously, including reducing water and chemical waste, lowering operational costs, improving compliance with municipal regulations, and ensuring consistent, reliable service. </w:t>
       </w:r>
       <w:r>
         <w:lastRenderedPageBreak/>
-        <w:t xml:space="preserve">centralized platforms improve both user experience and business efficiency </w:t>
+        <w:t xml:space="preserve">This aligns with global trends in digital service marketplaces, which demonstrate that centralized platforms improve both user experience and business efficiency </w:t>
       </w:r>
       <w:r>
         <w:rPr>
@@ -1997,7 +2081,7 @@
         <mc:AlternateContent>
           <mc:Choice Requires="wpg">
             <w:drawing>
-              <wp:inline distT="0" distB="0" distL="0" distR="0" wp14:anchorId="33451930" wp14:editId="6BA78A75">
+              <wp:inline distT="0" distB="0" distL="0" distR="0" wp14:anchorId="33451930" wp14:editId="0FE89F92">
                 <wp:extent cx="5439266" cy="4260916"/>
                 <wp:effectExtent l="0" t="0" r="0" b="6350"/>
                 <wp:docPr id="3" name="Group 3"/>
@@ -5833,6 +5917,438 @@
     </w:p>
     <w:p>
       <w:pPr>
+        <w:pStyle w:val="List-Item-1-ItemPara-XY"/>
+        <w:numPr>
+          <w:ilvl w:val="0"/>
+          <w:numId w:val="0"/>
+        </w:numPr>
+        <w:ind w:left="432" w:hanging="432"/>
+        <w:jc w:val="both"/>
+        <w:rPr>
+          <w:rFonts w:asciiTheme="minorHAnsi" w:hAnsiTheme="minorHAnsi"/>
+          <w:color w:val="00B0F0"/>
+          <w:lang w:val="en-GB"/>
+        </w:rPr>
+      </w:pPr>
+    </w:p>
+    <w:p>
+      <w:pPr>
+        <w:pStyle w:val="List-Item1-ItemPara-XY"/>
+        <w:numPr>
+          <w:ilvl w:val="0"/>
+          <w:numId w:val="0"/>
+        </w:numPr>
+        <w:rPr>
+          <w:rFonts w:asciiTheme="minorHAnsi" w:hAnsiTheme="minorHAnsi"/>
+          <w:color w:val="auto"/>
+          <w:lang w:val="en-GB"/>
+        </w:rPr>
+      </w:pPr>
+      <w:r>
+        <w:rPr>
+          <w:rFonts w:asciiTheme="minorHAnsi" w:hAnsiTheme="minorHAnsi"/>
+          <w:color w:val="auto"/>
+          <w:lang w:val="en-GB"/>
+        </w:rPr>
+        <w:t>To</w:t>
+      </w:r>
+      <w:r>
+        <w:rPr>
+          <w:rFonts w:asciiTheme="minorHAnsi" w:hAnsiTheme="minorHAnsi"/>
+          <w:color w:val="auto"/>
+          <w:lang w:val="en-GB"/>
+        </w:rPr>
+        <w:t xml:space="preserve"> </w:t>
+      </w:r>
+      <w:r>
+        <w:rPr>
+          <w:rFonts w:asciiTheme="minorHAnsi" w:hAnsiTheme="minorHAnsi"/>
+          <w:color w:val="auto"/>
+          <w:lang w:val="en-GB"/>
+        </w:rPr>
+        <w:t>fully understand the project we looked at aspects like “w</w:t>
+      </w:r>
+      <w:r>
+        <w:rPr>
+          <w:rFonts w:asciiTheme="minorHAnsi" w:hAnsiTheme="minorHAnsi"/>
+          <w:color w:val="auto"/>
+          <w:lang w:val="en-GB"/>
+        </w:rPr>
+        <w:t>hat does your client expect/need?</w:t>
+      </w:r>
+      <w:r>
+        <w:rPr>
+          <w:rFonts w:asciiTheme="minorHAnsi" w:hAnsiTheme="minorHAnsi"/>
+          <w:color w:val="auto"/>
+          <w:lang w:val="en-GB"/>
+        </w:rPr>
+        <w:t>”, “</w:t>
+      </w:r>
+      <w:r>
+        <w:rPr>
+          <w:rFonts w:asciiTheme="minorHAnsi" w:hAnsiTheme="minorHAnsi"/>
+          <w:color w:val="auto"/>
+          <w:lang w:val="en-GB"/>
+        </w:rPr>
+        <w:t>The goals of the project</w:t>
+      </w:r>
+      <w:r>
+        <w:rPr>
+          <w:rFonts w:asciiTheme="minorHAnsi" w:hAnsiTheme="minorHAnsi"/>
+          <w:color w:val="auto"/>
+          <w:lang w:val="en-GB"/>
+        </w:rPr>
+        <w:t>”, “</w:t>
+      </w:r>
+      <w:r>
+        <w:rPr>
+          <w:rFonts w:asciiTheme="minorHAnsi" w:hAnsiTheme="minorHAnsi"/>
+          <w:color w:val="auto"/>
+          <w:lang w:val="en-GB"/>
+        </w:rPr>
+        <w:t>What is the decision-making process of your client, and how will they approve and review the project work?</w:t>
+      </w:r>
+      <w:r>
+        <w:rPr>
+          <w:rFonts w:asciiTheme="minorHAnsi" w:hAnsiTheme="minorHAnsi"/>
+          <w:color w:val="auto"/>
+          <w:lang w:val="en-GB"/>
+        </w:rPr>
+        <w:t>”, “</w:t>
+      </w:r>
+      <w:r>
+        <w:rPr>
+          <w:rFonts w:asciiTheme="minorHAnsi" w:hAnsiTheme="minorHAnsi"/>
+          <w:color w:val="auto"/>
+          <w:lang w:val="en-GB"/>
+        </w:rPr>
+        <w:t>Who is the sponsor?</w:t>
+      </w:r>
+      <w:r>
+        <w:rPr>
+          <w:rFonts w:asciiTheme="minorHAnsi" w:hAnsiTheme="minorHAnsi"/>
+          <w:color w:val="auto"/>
+          <w:lang w:val="en-GB"/>
+        </w:rPr>
+        <w:t>”, “</w:t>
+      </w:r>
+      <w:r>
+        <w:rPr>
+          <w:rFonts w:asciiTheme="minorHAnsi" w:hAnsiTheme="minorHAnsi"/>
+          <w:color w:val="auto"/>
+          <w:lang w:val="en-GB"/>
+        </w:rPr>
+        <w:t>Who is the project manager?</w:t>
+      </w:r>
+      <w:r>
+        <w:rPr>
+          <w:rFonts w:asciiTheme="minorHAnsi" w:hAnsiTheme="minorHAnsi"/>
+          <w:color w:val="auto"/>
+          <w:lang w:val="en-GB"/>
+        </w:rPr>
+        <w:t>”, and lastly “</w:t>
+      </w:r>
+      <w:r>
+        <w:rPr>
+          <w:rFonts w:asciiTheme="minorHAnsi" w:hAnsiTheme="minorHAnsi"/>
+          <w:color w:val="auto"/>
+          <w:lang w:val="en-GB"/>
+        </w:rPr>
+        <w:t>What other stakeholders are important?</w:t>
+      </w:r>
+      <w:r>
+        <w:rPr>
+          <w:rFonts w:asciiTheme="minorHAnsi" w:hAnsiTheme="minorHAnsi"/>
+          <w:color w:val="auto"/>
+          <w:lang w:val="en-GB"/>
+        </w:rPr>
+        <w:t>”.</w:t>
+      </w:r>
+    </w:p>
+    <w:p>
+      <w:pPr>
+        <w:pStyle w:val="List-Item1-ItemPara-XY"/>
+        <w:numPr>
+          <w:ilvl w:val="0"/>
+          <w:numId w:val="0"/>
+        </w:numPr>
+        <w:rPr>
+          <w:rFonts w:asciiTheme="minorHAnsi" w:hAnsiTheme="minorHAnsi"/>
+          <w:color w:val="auto"/>
+          <w:lang w:val="en-GB"/>
+        </w:rPr>
+      </w:pPr>
+      <w:r>
+        <w:rPr>
+          <w:rFonts w:asciiTheme="minorHAnsi" w:hAnsiTheme="minorHAnsi"/>
+          <w:color w:val="auto"/>
+          <w:lang w:val="en-GB"/>
+        </w:rPr>
+        <w:t xml:space="preserve">Our </w:t>
+      </w:r>
+      <w:r>
+        <w:rPr>
+          <w:rFonts w:asciiTheme="minorHAnsi" w:hAnsiTheme="minorHAnsi"/>
+          <w:color w:val="auto"/>
+          <w:lang w:val="en-GB"/>
+        </w:rPr>
+        <w:t xml:space="preserve">app, </w:t>
+      </w:r>
+      <w:r>
+        <w:rPr>
+          <w:rFonts w:asciiTheme="minorHAnsi" w:hAnsiTheme="minorHAnsi"/>
+          <w:i/>
+          <w:iCs/>
+          <w:color w:val="auto"/>
+          <w:lang w:val="en-GB"/>
+        </w:rPr>
+        <w:t>SplashScreen</w:t>
+      </w:r>
+      <w:r>
+        <w:rPr>
+          <w:rFonts w:asciiTheme="minorHAnsi" w:hAnsiTheme="minorHAnsi"/>
+          <w:i/>
+          <w:iCs/>
+          <w:color w:val="auto"/>
+          <w:lang w:val="en-GB"/>
+        </w:rPr>
+        <w:t xml:space="preserve">, </w:t>
+      </w:r>
+      <w:r>
+        <w:rPr>
+          <w:rFonts w:asciiTheme="minorHAnsi" w:hAnsiTheme="minorHAnsi"/>
+          <w:color w:val="auto"/>
+          <w:lang w:val="en-GB"/>
+        </w:rPr>
+        <w:t xml:space="preserve">will help pool owners manage pool maintenance more effectively. We strive to </w:t>
+      </w:r>
+      <w:r>
+        <w:rPr>
+          <w:rFonts w:asciiTheme="minorHAnsi" w:hAnsiTheme="minorHAnsi"/>
+          <w:color w:val="auto"/>
+          <w:lang w:val="en-ZA"/>
+        </w:rPr>
+        <w:t xml:space="preserve">create </w:t>
+      </w:r>
+      <w:r>
+        <w:rPr>
+          <w:rFonts w:asciiTheme="minorHAnsi" w:hAnsiTheme="minorHAnsi"/>
+          <w:color w:val="auto"/>
+          <w:lang w:val="en-ZA"/>
+        </w:rPr>
+        <w:t>one platform that covers everything</w:t>
+      </w:r>
+      <w:r>
+        <w:rPr>
+          <w:rFonts w:asciiTheme="minorHAnsi" w:hAnsiTheme="minorHAnsi"/>
+          <w:color w:val="auto"/>
+          <w:lang w:val="en-ZA"/>
+        </w:rPr>
+        <w:t>.</w:t>
+      </w:r>
+      <w:r>
+        <w:rPr>
+          <w:rFonts w:asciiTheme="minorHAnsi" w:hAnsiTheme="minorHAnsi"/>
+          <w:color w:val="auto"/>
+          <w:lang w:val="en-ZA"/>
+        </w:rPr>
+        <w:t xml:space="preserve"> </w:t>
+      </w:r>
+      <w:r>
+        <w:rPr>
+          <w:rFonts w:asciiTheme="minorHAnsi" w:hAnsiTheme="minorHAnsi"/>
+          <w:color w:val="auto"/>
+          <w:lang w:val="en-ZA"/>
+        </w:rPr>
+        <w:t>Booking</w:t>
+      </w:r>
+      <w:r>
+        <w:rPr>
+          <w:rFonts w:asciiTheme="minorHAnsi" w:hAnsiTheme="minorHAnsi"/>
+          <w:color w:val="auto"/>
+          <w:lang w:val="en-ZA"/>
+        </w:rPr>
+        <w:t xml:space="preserve"> trusted service providers. </w:t>
+      </w:r>
+      <w:r>
+        <w:rPr>
+          <w:rFonts w:asciiTheme="minorHAnsi" w:hAnsiTheme="minorHAnsi"/>
+          <w:color w:val="auto"/>
+          <w:lang w:val="en-ZA"/>
+        </w:rPr>
+        <w:t>It</w:t>
+      </w:r>
+      <w:r>
+        <w:rPr>
+          <w:rFonts w:asciiTheme="minorHAnsi" w:hAnsiTheme="minorHAnsi"/>
+          <w:color w:val="auto"/>
+          <w:lang w:val="en-ZA"/>
+        </w:rPr>
+        <w:t xml:space="preserve"> w</w:t>
+      </w:r>
+      <w:r>
+        <w:rPr>
+          <w:rFonts w:asciiTheme="minorHAnsi" w:hAnsiTheme="minorHAnsi"/>
+          <w:color w:val="auto"/>
+          <w:lang w:val="en-ZA"/>
+        </w:rPr>
+        <w:t>ill</w:t>
+      </w:r>
+      <w:r>
+        <w:rPr>
+          <w:rFonts w:asciiTheme="minorHAnsi" w:hAnsiTheme="minorHAnsi"/>
+          <w:color w:val="auto"/>
+          <w:lang w:val="en-ZA"/>
+        </w:rPr>
+        <w:t xml:space="preserve"> help </w:t>
+      </w:r>
+      <w:r>
+        <w:rPr>
+          <w:rFonts w:asciiTheme="minorHAnsi" w:hAnsiTheme="minorHAnsi"/>
+          <w:color w:val="auto"/>
+          <w:lang w:val="en-ZA"/>
+        </w:rPr>
+        <w:t xml:space="preserve">pool </w:t>
+      </w:r>
+      <w:r>
+        <w:rPr>
+          <w:rFonts w:asciiTheme="minorHAnsi" w:hAnsiTheme="minorHAnsi"/>
+          <w:color w:val="auto"/>
+          <w:lang w:val="en-ZA"/>
+        </w:rPr>
+        <w:t xml:space="preserve">owners track chemical levels, plan maintenance, and book professionals easily. For </w:t>
+      </w:r>
+      <w:r>
+        <w:rPr>
+          <w:rFonts w:asciiTheme="minorHAnsi" w:hAnsiTheme="minorHAnsi"/>
+          <w:color w:val="auto"/>
+          <w:lang w:val="en-ZA"/>
+        </w:rPr>
+        <w:t>business owners</w:t>
+      </w:r>
+      <w:r>
+        <w:rPr>
+          <w:rFonts w:asciiTheme="minorHAnsi" w:hAnsiTheme="minorHAnsi"/>
+          <w:color w:val="auto"/>
+          <w:lang w:val="en-ZA"/>
+        </w:rPr>
+        <w:t xml:space="preserve">, it would provide a clear marketplace, help them find more customers, and </w:t>
+      </w:r>
+      <w:r>
+        <w:rPr>
+          <w:rFonts w:asciiTheme="minorHAnsi" w:hAnsiTheme="minorHAnsi"/>
+          <w:color w:val="auto"/>
+          <w:lang w:val="en-ZA"/>
+        </w:rPr>
+        <w:t>simplify marketing supplies and services</w:t>
+      </w:r>
+      <w:r>
+        <w:rPr>
+          <w:rFonts w:asciiTheme="minorHAnsi" w:hAnsiTheme="minorHAnsi"/>
+          <w:color w:val="auto"/>
+          <w:lang w:val="en-ZA"/>
+        </w:rPr>
+        <w:t>.</w:t>
+      </w:r>
+      <w:r>
+        <w:rPr>
+          <w:rFonts w:asciiTheme="minorHAnsi" w:hAnsiTheme="minorHAnsi"/>
+          <w:color w:val="auto"/>
+          <w:lang w:val="en-ZA"/>
+        </w:rPr>
+        <w:t xml:space="preserve"> </w:t>
+      </w:r>
+      <w:r>
+        <w:rPr>
+          <w:rFonts w:asciiTheme="minorHAnsi" w:hAnsiTheme="minorHAnsi"/>
+          <w:color w:val="auto"/>
+          <w:lang w:val="en-ZA"/>
+        </w:rPr>
+        <w:t>It will ultimately</w:t>
+      </w:r>
+      <w:r>
+        <w:rPr>
+          <w:rFonts w:asciiTheme="minorHAnsi" w:hAnsiTheme="minorHAnsi"/>
+          <w:color w:val="auto"/>
+          <w:lang w:val="en-ZA"/>
+        </w:rPr>
+        <w:t xml:space="preserve"> </w:t>
+      </w:r>
+      <w:r>
+        <w:rPr>
+          <w:rFonts w:asciiTheme="minorHAnsi" w:hAnsiTheme="minorHAnsi"/>
+          <w:color w:val="auto"/>
+          <w:lang w:val="en-ZA"/>
+        </w:rPr>
+        <w:t>build</w:t>
+      </w:r>
+      <w:r>
+        <w:rPr>
+          <w:rFonts w:asciiTheme="minorHAnsi" w:hAnsiTheme="minorHAnsi"/>
+          <w:color w:val="auto"/>
+          <w:lang w:val="en-ZA"/>
+        </w:rPr>
+        <w:t xml:space="preserve"> compan</w:t>
+      </w:r>
+      <w:r>
+        <w:rPr>
+          <w:rFonts w:asciiTheme="minorHAnsi" w:hAnsiTheme="minorHAnsi"/>
+          <w:color w:val="auto"/>
+          <w:lang w:val="en-ZA"/>
+        </w:rPr>
+        <w:t>ie</w:t>
+      </w:r>
+      <w:r>
+        <w:rPr>
+          <w:rFonts w:asciiTheme="minorHAnsi" w:hAnsiTheme="minorHAnsi"/>
+          <w:color w:val="auto"/>
+          <w:lang w:val="en-ZA"/>
+        </w:rPr>
+        <w:t>s brand presence while giving customers guidance on pool upkeep.</w:t>
+      </w:r>
+    </w:p>
+    <w:p>
+      <w:pPr>
+        <w:pStyle w:val="List-Item-1-ItemPara-XY"/>
+        <w:numPr>
+          <w:ilvl w:val="0"/>
+          <w:numId w:val="0"/>
+        </w:numPr>
+        <w:ind w:left="432" w:hanging="432"/>
+        <w:jc w:val="both"/>
+        <w:rPr>
+          <w:rFonts w:asciiTheme="minorHAnsi" w:hAnsiTheme="minorHAnsi"/>
+          <w:color w:val="auto"/>
+          <w:lang w:val="en-GB"/>
+        </w:rPr>
+      </w:pPr>
+      <w:r>
+        <w:rPr>
+          <w:rFonts w:asciiTheme="minorHAnsi" w:hAnsiTheme="minorHAnsi"/>
+          <w:color w:val="auto"/>
+          <w:lang w:val="en-GB"/>
+        </w:rPr>
+        <w:t xml:space="preserve">The Ripple Effects goal for the project is to </w:t>
+      </w:r>
+    </w:p>
+    <w:p>
+      <w:pPr>
+        <w:pStyle w:val="List-Item-1-ItemPara-XY"/>
+        <w:numPr>
+          <w:ilvl w:val="0"/>
+          <w:numId w:val="0"/>
+        </w:numPr>
+        <w:ind w:left="432" w:hanging="432"/>
+        <w:jc w:val="both"/>
+        <w:rPr>
+          <w:rFonts w:asciiTheme="minorHAnsi" w:hAnsiTheme="minorHAnsi"/>
+          <w:color w:val="00B0F0"/>
+          <w:lang w:val="en-GB"/>
+        </w:rPr>
+      </w:pPr>
+    </w:p>
+    <w:p>
+      <w:pPr>
         <w:pStyle w:val="ParaBlock-XY"/>
         <w:jc w:val="both"/>
         <w:rPr>
@@ -5868,6 +6384,7 @@
           <w:color w:val="00B0F0"/>
           <w:lang w:val="en-GB"/>
         </w:rPr>
+        <w:lastRenderedPageBreak/>
         <w:t xml:space="preserve">Questions that may impact a project plan: </w:t>
       </w:r>
     </w:p>
@@ -6177,7 +6694,6 @@
           <w:color w:val="00B0F0"/>
           <w:lang w:val="en-GB"/>
         </w:rPr>
-        <w:lastRenderedPageBreak/>
         <w:t>Milestones and deliverables</w:t>
       </w:r>
     </w:p>
@@ -6666,6 +7182,7 @@
           <w:b/>
           <w:lang w:val="en-GB"/>
         </w:rPr>
+        <w:lastRenderedPageBreak/>
         <w:t>Platform:</w:t>
       </w:r>
       <w:r>
@@ -7064,6 +7581,7 @@
           <w:noProof/>
           <w:lang w:val="en-GB"/>
         </w:rPr>
+        <w:lastRenderedPageBreak/>
         <w:drawing>
           <wp:inline distT="0" distB="0" distL="0" distR="0" wp14:anchorId="312E2C8A" wp14:editId="2549F24A">
             <wp:extent cx="5727700" cy="2842895"/>
@@ -7245,17 +7763,7 @@
           <w:color w:val="auto"/>
           <w:lang w:val="en-GB"/>
         </w:rPr>
-        <w:t xml:space="preserve">is then segmented into feasible tasks. Our current sprint, the Business Case is broken up into a couple of tasks such as Write Introduction, Section 1.1 Problem Statement etc. where each task can have subtasks </w:t>
-      </w:r>
-      <w:r>
-        <w:rPr>
-          <w:rFonts w:asciiTheme="minorHAnsi" w:hAnsiTheme="minorHAnsi"/>
-          <w:iCs/>
-          <w:color w:val="auto"/>
-          <w:lang w:val="en-GB"/>
-        </w:rPr>
-        <w:lastRenderedPageBreak/>
-        <w:t xml:space="preserve">represented by the number to completion, </w:t>
+        <w:t xml:space="preserve">is then segmented into feasible tasks. Our current sprint, the Business Case is broken up into a couple of tasks such as Write Introduction, Section 1.1 Problem Statement etc. where each task can have subtasks represented by the number to completion, </w:t>
       </w:r>
       <w:r>
         <w:rPr>
@@ -7600,9 +8108,8 @@
           <w:color w:val="00B0F0"/>
           <w:lang w:val="en-GB"/>
         </w:rPr>
-        <w:t xml:space="preserve">The entire project could be ruined if a woman in labour runs across a road and a driver </w:t>
-      </w:r>
-      <w:proofErr w:type="gramStart"/>
+        <w:t xml:space="preserve">The entire project could be ruined </w:t>
+      </w:r>
       <w:r>
         <w:rPr>
           <w:rFonts w:asciiTheme="minorHAnsi" w:hAnsiTheme="minorHAnsi" w:cstheme="minorBidi"/>
@@ -7611,9 +8118,10 @@
           <w:color w:val="00B0F0"/>
           <w:lang w:val="en-GB"/>
         </w:rPr>
-        <w:t>has to</w:t>
-      </w:r>
-      <w:proofErr w:type="gramEnd"/>
+        <w:lastRenderedPageBreak/>
+        <w:t xml:space="preserve">if a woman in labour runs across a road and a driver </w:t>
+      </w:r>
+      <w:proofErr w:type="gramStart"/>
       <w:r>
         <w:rPr>
           <w:rFonts w:asciiTheme="minorHAnsi" w:hAnsiTheme="minorHAnsi" w:cstheme="minorBidi"/>
@@ -7622,6 +8130,17 @@
           <w:color w:val="00B0F0"/>
           <w:lang w:val="en-GB"/>
         </w:rPr>
+        <w:t>has to</w:t>
+      </w:r>
+      <w:proofErr w:type="gramEnd"/>
+      <w:r>
+        <w:rPr>
+          <w:rFonts w:asciiTheme="minorHAnsi" w:hAnsiTheme="minorHAnsi" w:cstheme="minorBidi"/>
+          <w:i/>
+          <w:iCs/>
+          <w:color w:val="00B0F0"/>
+          <w:lang w:val="en-GB"/>
+        </w:rPr>
         <w:t xml:space="preserve"> swerve to avoid her. The driver crashes into a bus and loses a wheel, which rolls across the road, pulls along a bag of dynamite, which was about to be used. The dynamite then explodes next to a lamppost, which shoots, like a rocket, through the window of the project teams office. The rocket hits the project leader in the head and the project leader, by mistake, deletes all the code, which has been written. The rocket continues through the office and finally lands on a shelf filled with super magnets, which then fall onto the server, which contains all the backups and removes them all.</w:t>
       </w:r>
       <w:r>
@@ -7795,7 +8314,6 @@
           <w:color w:val="00B0F0"/>
           <w:lang w:val="en-GB"/>
         </w:rPr>
-        <w:lastRenderedPageBreak/>
         <w:t>Transferable risks:</w:t>
       </w:r>
       <w:r>
@@ -7953,6 +8471,7 @@
     <w:p>
       <w:proofErr w:type="spellStart"/>
       <w:r>
+        <w:lastRenderedPageBreak/>
         <w:t>Centers</w:t>
       </w:r>
       <w:proofErr w:type="spellEnd"/>
@@ -7989,40 +8508,54 @@
         </w:r>
       </w:hyperlink>
     </w:p>
-    <w:p>
-      <w:r>
+    <w:p/>
+    <w:p>
+      <w:r>
+        <w:rPr>
+          <w:highlight w:val="yellow"/>
+        </w:rPr>
         <w:t xml:space="preserve">Department of Water and Sanitation (South Africa). (2023). </w:t>
       </w:r>
       <w:r>
         <w:rPr>
           <w:i/>
           <w:iCs/>
+          <w:highlight w:val="yellow"/>
         </w:rPr>
         <w:t>National State of Water Report 2023</w:t>
       </w:r>
       <w:r>
+        <w:rPr>
+          <w:highlight w:val="yellow"/>
+        </w:rPr>
         <w:t xml:space="preserve">. </w:t>
       </w:r>
-      <w:hyperlink r:id="rId33" w:tgtFrame="_new" w:history="1">
+      <w:hyperlink r:id="rId33" w:history="1">
         <w:r>
           <w:rPr>
             <w:rStyle w:val="Hyperlink"/>
+            <w:highlight w:val="yellow"/>
           </w:rPr>
           <w:t>https://www.dws.gov.za/Projects/National%20State%20of%20Water%20Report/Documents/National%20State%20of%20Water%20Report%202023_FinalVer3.0.pdf</w:t>
         </w:r>
       </w:hyperlink>
       <w:r>
+        <w:rPr>
+          <w:highlight w:val="yellow"/>
+        </w:rPr>
         <w:t xml:space="preserve"> </w:t>
       </w:r>
       <w:hyperlink r:id="rId34" w:tgtFrame="_blank" w:history="1">
         <w:r>
           <w:rPr>
             <w:rStyle w:val="Hyperlink"/>
+            <w:highlight w:val="yellow"/>
           </w:rPr>
           <w:t>Department of Water and Sanitation</w:t>
         </w:r>
       </w:hyperlink>
     </w:p>
+    <w:p/>
     <w:p>
       <w:r>
         <w:t xml:space="preserve">Department of Water and Sanitation (South Africa). (2022). </w:t>
@@ -8057,18 +8590,26 @@
         </w:r>
       </w:hyperlink>
     </w:p>
-    <w:p>
-      <w:r>
+    <w:p/>
+    <w:p>
+      <w:r>
+        <w:rPr>
+          <w:highlight w:val="yellow"/>
+        </w:rPr>
         <w:t xml:space="preserve">Du Plessis, J., &amp; Jacobs, H. E. (2015). Mitigating the impact of swimming pools on domestic water demand. </w:t>
       </w:r>
       <w:r>
         <w:rPr>
           <w:i/>
           <w:iCs/>
+          <w:highlight w:val="yellow"/>
         </w:rPr>
         <w:t>Water SA</w:t>
       </w:r>
       <w:r>
+        <w:rPr>
+          <w:highlight w:val="yellow"/>
+        </w:rPr>
         <w:t xml:space="preserve">, 41(2), 238–244. https://www.scielo.org.za/scielo.php?script=sci_arttext&amp;pid=S1816-79502015000200010 </w:t>
       </w:r>
       <w:hyperlink r:id="rId37" w:tgtFrame="_blank" w:history="1">
@@ -8076,40 +8617,56 @@
         <w:r>
           <w:rPr>
             <w:rStyle w:val="Hyperlink"/>
+            <w:highlight w:val="yellow"/>
           </w:rPr>
           <w:t>SciELO</w:t>
         </w:r>
         <w:proofErr w:type="spellEnd"/>
       </w:hyperlink>
     </w:p>
+    <w:p/>
     <w:p>
       <w:proofErr w:type="spellStart"/>
       <w:r>
+        <w:rPr>
+          <w:highlight w:val="yellow"/>
+        </w:rPr>
         <w:t>Econsultancy</w:t>
       </w:r>
       <w:proofErr w:type="spellEnd"/>
       <w:r>
+        <w:rPr>
+          <w:highlight w:val="yellow"/>
+        </w:rPr>
         <w:t xml:space="preserve">. (2022). </w:t>
       </w:r>
       <w:r>
         <w:rPr>
           <w:i/>
           <w:iCs/>
+          <w:highlight w:val="yellow"/>
         </w:rPr>
         <w:t>HTH South African swimming pool care campaign case study</w:t>
       </w:r>
       <w:r>
+        <w:rPr>
+          <w:highlight w:val="yellow"/>
+        </w:rPr>
         <w:t xml:space="preserve">. </w:t>
       </w:r>
       <w:hyperlink r:id="rId38" w:tgtFrame="_new" w:history="1">
         <w:r>
           <w:rPr>
             <w:rStyle w:val="Hyperlink"/>
+            <w:highlight w:val="yellow"/>
           </w:rPr>
           <w:t>https://econsultancy.com/case-studies/view/hth-south-african-swimming/</w:t>
         </w:r>
       </w:hyperlink>
       <w:r>
+        <w:rPr>
+          <w:highlight w:val="yellow"/>
+        </w:rPr>
         <w:t xml:space="preserve"> </w:t>
       </w:r>
       <w:hyperlink r:id="rId39" w:tgtFrame="_blank" w:history="1">
@@ -8117,29 +8674,41 @@
         <w:r>
           <w:rPr>
             <w:rStyle w:val="Hyperlink"/>
+            <w:highlight w:val="yellow"/>
           </w:rPr>
           <w:t>Econsultancy</w:t>
         </w:r>
         <w:proofErr w:type="spellEnd"/>
       </w:hyperlink>
     </w:p>
+    <w:p/>
     <w:p>
       <w:proofErr w:type="spellStart"/>
       <w:r>
+        <w:rPr>
+          <w:highlight w:val="yellow"/>
+        </w:rPr>
         <w:t>Musango</w:t>
       </w:r>
       <w:proofErr w:type="spellEnd"/>
       <w:r>
+        <w:rPr>
+          <w:highlight w:val="yellow"/>
+        </w:rPr>
         <w:t xml:space="preserve">, J. K., &amp; Peter, C. (2012). Swimming pools and intra-city climates: Influences on residential water consumption in Cape Town. </w:t>
       </w:r>
       <w:r>
         <w:rPr>
           <w:i/>
           <w:iCs/>
+          <w:highlight w:val="yellow"/>
         </w:rPr>
         <w:t>Water SA</w:t>
       </w:r>
       <w:r>
+        <w:rPr>
+          <w:highlight w:val="yellow"/>
+        </w:rPr>
         <w:t xml:space="preserve">, 38(1), 91–98. https://www.scielo.org.za/scielo.php?script=sci_arttext&amp;pid=S1816-79502012000100016 </w:t>
       </w:r>
       <w:hyperlink r:id="rId40" w:tgtFrame="_blank" w:history="1">
@@ -8147,12 +8716,14 @@
         <w:r>
           <w:rPr>
             <w:rStyle w:val="Hyperlink"/>
+            <w:highlight w:val="yellow"/>
           </w:rPr>
           <w:t>SciELO</w:t>
         </w:r>
         <w:proofErr w:type="spellEnd"/>
       </w:hyperlink>
     </w:p>
+    <w:p/>
     <w:p>
       <w:r>
         <w:t xml:space="preserve">Pool-Cover South Africa. (2025). </w:t>
@@ -8187,109 +8758,148 @@
         </w:r>
       </w:hyperlink>
     </w:p>
-    <w:p>
-      <w:r>
-        <w:lastRenderedPageBreak/>
+    <w:p/>
+    <w:p>
+      <w:r>
+        <w:rPr>
+          <w:highlight w:val="yellow"/>
+        </w:rPr>
         <w:t xml:space="preserve">South African Government. (n.d.). </w:t>
       </w:r>
       <w:r>
         <w:rPr>
           <w:i/>
           <w:iCs/>
+          <w:highlight w:val="yellow"/>
         </w:rPr>
         <w:t>Geography and climate</w:t>
       </w:r>
       <w:r>
+        <w:rPr>
+          <w:highlight w:val="yellow"/>
+        </w:rPr>
         <w:t xml:space="preserve">. </w:t>
       </w:r>
       <w:hyperlink r:id="rId43" w:tgtFrame="_new" w:history="1">
         <w:r>
           <w:rPr>
             <w:rStyle w:val="Hyperlink"/>
+            <w:highlight w:val="yellow"/>
           </w:rPr>
           <w:t>https://www.gov.za/about-sa/geography-and-climate</w:t>
         </w:r>
       </w:hyperlink>
       <w:r>
+        <w:rPr>
+          <w:highlight w:val="yellow"/>
+        </w:rPr>
         <w:t xml:space="preserve"> </w:t>
       </w:r>
       <w:hyperlink r:id="rId44" w:tgtFrame="_blank" w:history="1">
         <w:r>
           <w:rPr>
             <w:rStyle w:val="Hyperlink"/>
+            <w:highlight w:val="yellow"/>
           </w:rPr>
           <w:t>Government of South Africa</w:t>
         </w:r>
       </w:hyperlink>
     </w:p>
-    <w:p>
-      <w:r>
+    <w:p/>
+    <w:p>
+      <w:r>
+        <w:rPr>
+          <w:highlight w:val="yellow"/>
+        </w:rPr>
         <w:t xml:space="preserve">Wuppertal Institute for Climate, Environment and Energy. (2015). </w:t>
       </w:r>
       <w:r>
         <w:rPr>
           <w:i/>
           <w:iCs/>
+          <w:highlight w:val="yellow"/>
         </w:rPr>
         <w:t>Energy efficient swimming pool pumps (South Africa)</w:t>
       </w:r>
       <w:r>
+        <w:rPr>
+          <w:highlight w:val="yellow"/>
+        </w:rPr>
         <w:t xml:space="preserve">. </w:t>
       </w:r>
       <w:hyperlink r:id="rId45" w:tgtFrame="_new" w:history="1">
         <w:r>
           <w:rPr>
             <w:rStyle w:val="Hyperlink"/>
+            <w:highlight w:val="yellow"/>
           </w:rPr>
           <w:t>https://bigee.net/media/filer_public/2015/07/23/bigee_south_africa_poolpumps_20150723.pdf</w:t>
         </w:r>
       </w:hyperlink>
       <w:r>
+        <w:rPr>
+          <w:highlight w:val="yellow"/>
+        </w:rPr>
         <w:t xml:space="preserve"> </w:t>
       </w:r>
       <w:hyperlink r:id="rId46" w:tgtFrame="_blank" w:history="1">
         <w:r>
           <w:rPr>
             <w:rStyle w:val="Hyperlink"/>
+            <w:highlight w:val="yellow"/>
           </w:rPr>
           <w:t>bigee.net</w:t>
         </w:r>
       </w:hyperlink>
     </w:p>
-    <w:p>
-      <w:r>
+    <w:p/>
+    <w:p>
+      <w:r>
+        <w:rPr>
+          <w:highlight w:val="yellow"/>
+        </w:rPr>
         <w:t xml:space="preserve">World Bank Climate Change Knowledge Portal. (n.d.). </w:t>
       </w:r>
       <w:r>
         <w:rPr>
           <w:i/>
           <w:iCs/>
+          <w:highlight w:val="yellow"/>
         </w:rPr>
         <w:t>South Africa – climatology</w:t>
       </w:r>
       <w:r>
+        <w:rPr>
+          <w:highlight w:val="yellow"/>
+        </w:rPr>
         <w:t xml:space="preserve">. </w:t>
       </w:r>
       <w:hyperlink r:id="rId47" w:tgtFrame="_new" w:history="1">
         <w:r>
           <w:rPr>
             <w:rStyle w:val="Hyperlink"/>
+            <w:highlight w:val="yellow"/>
           </w:rPr>
           <w:t>https://climateknowledgeportal.worldbank.org/country/south-africa/climate-data-historical</w:t>
         </w:r>
       </w:hyperlink>
       <w:r>
+        <w:rPr>
+          <w:highlight w:val="yellow"/>
+        </w:rPr>
         <w:t xml:space="preserve"> </w:t>
       </w:r>
       <w:hyperlink r:id="rId48" w:tgtFrame="_blank" w:history="1">
         <w:r>
           <w:rPr>
             <w:rStyle w:val="Hyperlink"/>
+            <w:highlight w:val="yellow"/>
           </w:rPr>
           <w:t>climateknowledgeportal.worldbank.org</w:t>
         </w:r>
       </w:hyperlink>
     </w:p>
+    <w:p/>
     <w:p>
       <w:proofErr w:type="spellStart"/>
       <w:r>
@@ -8331,8 +8941,10 @@
         <w:proofErr w:type="spellEnd"/>
       </w:hyperlink>
     </w:p>
-    <w:p>
-      <w:r>
+    <w:p/>
+    <w:p>
+      <w:r>
+        <w:lastRenderedPageBreak/>
         <w:t xml:space="preserve">City of Cape Town. (2019). </w:t>
       </w:r>
       <w:r>
@@ -8365,6 +8977,7 @@
         </w:r>
       </w:hyperlink>
     </w:p>
+    <w:p/>
     <w:p>
       <w:r>
         <w:t xml:space="preserve">The Guardian. (2023, April 10). </w:t>
@@ -8399,40 +9012,68 @@
         </w:r>
       </w:hyperlink>
     </w:p>
-    <w:p>
-      <w:r>
+    <w:p/>
+    <w:p>
+      <w:r>
+        <w:rPr>
+          <w:highlight w:val="yellow"/>
+        </w:rPr>
         <w:t xml:space="preserve">The Washington Post. (2023, April 11). </w:t>
       </w:r>
       <w:r>
         <w:rPr>
           <w:i/>
           <w:iCs/>
+          <w:highlight w:val="yellow"/>
         </w:rPr>
         <w:t>Wealthy residents’ pools and gardens are driving water crises</w:t>
       </w:r>
       <w:r>
+        <w:rPr>
+          <w:highlight w:val="yellow"/>
+        </w:rPr>
         <w:t xml:space="preserve">. </w:t>
       </w:r>
       <w:hyperlink r:id="rId55" w:tgtFrame="_new" w:history="1">
         <w:r>
           <w:rPr>
             <w:rStyle w:val="Hyperlink"/>
+            <w:highlight w:val="yellow"/>
           </w:rPr>
           <w:t>https://www.washingtonpost.com/climate-environment/2023/04/11/water-crisis-swimming-pool-cape-town/</w:t>
         </w:r>
       </w:hyperlink>
       <w:r>
+        <w:rPr>
+          <w:highlight w:val="yellow"/>
+        </w:rPr>
         <w:t xml:space="preserve"> </w:t>
       </w:r>
       <w:hyperlink r:id="rId56" w:tgtFrame="_blank" w:history="1">
         <w:r>
           <w:rPr>
             <w:rStyle w:val="Hyperlink"/>
+            <w:highlight w:val="yellow"/>
           </w:rPr>
-          <w:t>The Washington Post</w:t>
+          <w:t>T</w:t>
+        </w:r>
+        <w:r>
+          <w:rPr>
+            <w:rStyle w:val="Hyperlink"/>
+            <w:highlight w:val="yellow"/>
+          </w:rPr>
+          <w:t>h</w:t>
+        </w:r>
+        <w:r>
+          <w:rPr>
+            <w:rStyle w:val="Hyperlink"/>
+            <w:highlight w:val="yellow"/>
+          </w:rPr>
+          <w:t>e Washington Post</w:t>
         </w:r>
       </w:hyperlink>
     </w:p>
+    <w:p/>
     <w:p>
       <w:r>
         <w:t xml:space="preserve">National Poly Industries. (2017). </w:t>
@@ -8469,11 +9110,75 @@
     </w:p>
     <w:p/>
     <w:p>
-      <w:pPr>
-        <w:rPr>
-          <w:lang w:val="en-GB"/>
-        </w:rPr>
-      </w:pPr>
+      <w:r>
+        <w:t xml:space="preserve">Lee, S., &amp; Kim, H. (2019). Digital marketplaces and service centralization: Efficiency and consumer satisfaction. </w:t>
+      </w:r>
+      <w:r>
+        <w:rPr>
+          <w:i/>
+          <w:iCs/>
+        </w:rPr>
+        <w:t>Journal of Business Research, 98</w:t>
+      </w:r>
+      <w:r>
+        <w:t>, 344–352.</w:t>
+      </w:r>
+    </w:p>
+    <w:p/>
+    <w:p>
+      <w:r>
+        <w:t xml:space="preserve">Patel, A., Mehta, R., &amp; Sharma, S. (2021). Online service platforms: Market consolidation and customer trust. </w:t>
+      </w:r>
+      <w:r>
+        <w:rPr>
+          <w:i/>
+          <w:iCs/>
+        </w:rPr>
+        <w:t>Journal of Retailing and Consumer Services, 60</w:t>
+      </w:r>
+      <w:r>
+        <w:t>, 102–111</w:t>
+      </w:r>
+      <w:r>
+        <w:t>.</w:t>
+      </w:r>
+    </w:p>
+    <w:p/>
+    <w:p/>
+    <w:p>
+      <w:pPr>
+        <w:rPr>
+          <w:lang w:val="en-GB"/>
+        </w:rPr>
+      </w:pPr>
+    </w:p>
+    <w:p>
+      <w:r>
+        <w:t xml:space="preserve">South African Government, n.d.; World Bank, n.d. </w:t>
+      </w:r>
+    </w:p>
+    <w:p>
+      <w:pPr>
+        <w:rPr>
+          <w:lang w:val="en-GB"/>
+        </w:rPr>
+      </w:pPr>
+      <w:hyperlink r:id="rId59" w:tgtFrame="_blank" w:history="1">
+        <w:r>
+          <w:rPr>
+            <w:rStyle w:val="Hyperlink"/>
+          </w:rPr>
+          <w:t>Government of South Africa</w:t>
+        </w:r>
+      </w:hyperlink>
+      <w:hyperlink r:id="rId60" w:tgtFrame="_blank" w:history="1">
+        <w:r>
+          <w:rPr>
+            <w:rStyle w:val="Hyperlink"/>
+          </w:rPr>
+          <w:t>climateknowledgeportal.worldbank.org</w:t>
+        </w:r>
+      </w:hyperlink>
     </w:p>
     <w:sectPr>
       <w:pgSz w:w="11900" w:h="16840"/>
@@ -10661,7 +11366,6 @@
   <w:style w:type="character" w:default="1" w:styleId="DefaultParagraphFont">
     <w:name w:val="Default Paragraph Font"/>
     <w:uiPriority w:val="1"/>
-    <w:semiHidden/>
     <w:unhideWhenUsed/>
   </w:style>
   <w:style w:type="table" w:default="1" w:styleId="TableNormal">

</xml_diff>

<commit_message>
Update - Basic Stuff
1. Getting kicked out :)
</commit_message>
<xml_diff>
--- a/Documentation/The Ripple Effect - BUSINESS CASE.docx
+++ b/Documentation/The Ripple Effect - BUSINESS CASE.docx
@@ -1,6 +1,6 @@
 
 <file path=word/document.xml><?xml version="1.0" encoding="utf-8"?>
-<w:document xmlns:wpc="http://schemas.microsoft.com/office/word/2010/wordprocessingCanvas" xmlns:cx="http://schemas.microsoft.com/office/drawing/2014/chartex" xmlns:cx1="http://schemas.microsoft.com/office/drawing/2015/9/8/chartex" xmlns:cx2="http://schemas.microsoft.com/office/drawing/2015/10/21/chartex" xmlns:cx3="http://schemas.microsoft.com/office/drawing/2016/5/9/chartex" xmlns:cx4="http://schemas.microsoft.com/office/drawing/2016/5/10/chartex" xmlns:cx5="http://schemas.microsoft.com/office/drawing/2016/5/11/chartex" xmlns:cx6="http://schemas.microsoft.com/office/drawing/2016/5/12/chartex" xmlns:cx7="http://schemas.microsoft.com/office/drawing/2016/5/13/chartex" xmlns:cx8="http://schemas.microsoft.com/office/drawing/2016/5/14/chartex" xmlns:mc="http://schemas.openxmlformats.org/markup-compatibility/2006" xmlns:aink="http://schemas.microsoft.com/office/drawing/2016/ink" xmlns:am3d="http://schemas.microsoft.com/office/drawing/2017/model3d" xmlns:o="urn:schemas-microsoft-com:office:office" xmlns:oel="http://schemas.microsoft.com/office/2019/extlst" xmlns:r="http://schemas.openxmlformats.org/officeDocument/2006/relationships" xmlns:m="http://schemas.openxmlformats.org/officeDocument/2006/math" xmlns:v="urn:schemas-microsoft-com:vml" xmlns:wp14="http://schemas.microsoft.com/office/word/2010/wordprocessingDrawing" xmlns:wp="http://schemas.openxmlformats.org/drawingml/2006/wordprocessingDrawing" xmlns:w10="urn:schemas-microsoft-com:office:word" xmlns:w="http://schemas.openxmlformats.org/wordprocessingml/2006/main" xmlns:w14="http://schemas.microsoft.com/office/word/2010/wordml" xmlns:w15="http://schemas.microsoft.com/office/word/2012/wordml" xmlns:w16cex="http://schemas.microsoft.com/office/word/2018/wordml/cex" xmlns:w16cid="http://schemas.microsoft.com/office/word/2016/wordml/cid" xmlns:w16="http://schemas.microsoft.com/office/word/2018/wordml" xmlns:w16du="http://schemas.microsoft.com/office/word/2023/wordml/word16du" xmlns:w16sdtdh="http://schemas.microsoft.com/office/word/2020/wordml/sdtdatahash" xmlns:w16sdtfl="http://schemas.microsoft.com/office/word/2024/wordml/sdtformatlock" xmlns:w16se="http://schemas.microsoft.com/office/word/2015/wordml/symex" xmlns:wpg="http://schemas.microsoft.com/office/word/2010/wordprocessingGroup" xmlns:wpi="http://schemas.microsoft.com/office/word/2010/wordprocessingInk" xmlns:wne="http://schemas.microsoft.com/office/word/2006/wordml" xmlns:wps="http://schemas.microsoft.com/office/word/2010/wordprocessingShape" mc:Ignorable="w14 w15 w16se w16cid w16 w16cex w16sdtdh w16sdtfl w16du wp14">
+<w:document xmlns:wpc="http://schemas.microsoft.com/office/word/2010/wordprocessingCanvas" xmlns:cx="http://schemas.microsoft.com/office/drawing/2014/chartex" xmlns:cx1="http://schemas.microsoft.com/office/drawing/2015/9/8/chartex" xmlns:cx2="http://schemas.microsoft.com/office/drawing/2015/10/21/chartex" xmlns:cx3="http://schemas.microsoft.com/office/drawing/2016/5/9/chartex" xmlns:cx4="http://schemas.microsoft.com/office/drawing/2016/5/10/chartex" xmlns:cx5="http://schemas.microsoft.com/office/drawing/2016/5/11/chartex" xmlns:cx6="http://schemas.microsoft.com/office/drawing/2016/5/12/chartex" xmlns:cx7="http://schemas.microsoft.com/office/drawing/2016/5/13/chartex" xmlns:cx8="http://schemas.microsoft.com/office/drawing/2016/5/14/chartex" xmlns:mc="http://schemas.openxmlformats.org/markup-compatibility/2006" xmlns:aink="http://schemas.microsoft.com/office/drawing/2016/ink" xmlns:am3d="http://schemas.microsoft.com/office/drawing/2017/model3d" xmlns:o="urn:schemas-microsoft-com:office:office" xmlns:r="http://schemas.openxmlformats.org/officeDocument/2006/relationships" xmlns:m="http://schemas.openxmlformats.org/officeDocument/2006/math" xmlns:v="urn:schemas-microsoft-com:vml" xmlns:wp14="http://schemas.microsoft.com/office/word/2010/wordprocessingDrawing" xmlns:wp="http://schemas.openxmlformats.org/drawingml/2006/wordprocessingDrawing" xmlns:w10="urn:schemas-microsoft-com:office:word" xmlns:w="http://schemas.openxmlformats.org/wordprocessingml/2006/main" xmlns:w14="http://schemas.microsoft.com/office/word/2010/wordml" xmlns:w15="http://schemas.microsoft.com/office/word/2012/wordml" xmlns:w16cid="http://schemas.microsoft.com/office/word/2016/wordml/cid" xmlns:w16se="http://schemas.microsoft.com/office/word/2015/wordml/symex" xmlns:wpg="http://schemas.microsoft.com/office/word/2010/wordprocessingGroup" xmlns:wpi="http://schemas.microsoft.com/office/word/2010/wordprocessingInk" xmlns:wne="http://schemas.microsoft.com/office/word/2006/wordml" xmlns:wps="http://schemas.microsoft.com/office/word/2010/wordprocessingShape" mc:Ignorable="w14 w15 w16se w16cid wp14">
   <w:body>
     <w:p>
       <w:pPr>
@@ -208,6 +208,190 @@
           <w:lang w:val="en-GB"/>
         </w:rPr>
         <w:t>The introduction starts with describing the purpose of this document and what it will cover.</w:t>
+      </w:r>
+    </w:p>
+    <w:p>
+      <w:pPr>
+        <w:rPr>
+          <w:lang w:val="en-GB"/>
+        </w:rPr>
+      </w:pPr>
+      <w:r>
+        <w:rPr>
+          <w:lang w:val="en-GB"/>
+        </w:rPr>
+        <w:t xml:space="preserve">This document serves as a comprehensive business case for our proposed project, </w:t>
+      </w:r>
+      <w:r>
+        <w:rPr>
+          <w:i/>
+          <w:lang w:val="en-GB"/>
+        </w:rPr>
+        <w:t>Splash Screen</w:t>
+      </w:r>
+      <w:r>
+        <w:rPr>
+          <w:lang w:val="en-GB"/>
+        </w:rPr>
+        <w:t xml:space="preserve">, a localized mobile application created to simplify swimming pool maintenance in South Africa. </w:t>
+      </w:r>
+      <w:r>
+        <w:rPr>
+          <w:lang w:val="en-GB"/>
+        </w:rPr>
+        <w:t xml:space="preserve">As we structured this document, we kept the principles of the Software Development Life Cycle in mind. </w:t>
+      </w:r>
+      <w:r>
+        <w:rPr>
+          <w:lang w:val="en-GB"/>
+        </w:rPr>
+        <w:t>As a result,</w:t>
+      </w:r>
+      <w:r>
+        <w:rPr>
+          <w:lang w:val="en-GB"/>
+        </w:rPr>
+        <w:t xml:space="preserve"> </w:t>
+      </w:r>
+      <w:r>
+        <w:rPr>
+          <w:lang w:val="en-GB"/>
+        </w:rPr>
+        <w:t>this</w:t>
+      </w:r>
+      <w:r>
+        <w:rPr>
+          <w:lang w:val="en-GB"/>
+        </w:rPr>
+        <w:t xml:space="preserve"> business case </w:t>
+      </w:r>
+      <w:r>
+        <w:rPr>
+          <w:lang w:val="en-GB"/>
+        </w:rPr>
+        <w:t xml:space="preserve">is </w:t>
+      </w:r>
+      <w:r>
+        <w:rPr>
+          <w:lang w:val="en-GB"/>
+        </w:rPr>
+        <w:t xml:space="preserve">segmented into three key </w:t>
+      </w:r>
+      <w:r>
+        <w:rPr>
+          <w:lang w:val="en-GB"/>
+        </w:rPr>
+        <w:t xml:space="preserve">primary </w:t>
+      </w:r>
+      <w:r>
+        <w:rPr>
+          <w:lang w:val="en-GB"/>
+        </w:rPr>
+        <w:t xml:space="preserve">sections: a detailed look at the problem, a concrete analysis of our solution, and a strategic plan for </w:t>
+      </w:r>
+      <w:r>
+        <w:rPr>
+          <w:lang w:val="en-GB"/>
+        </w:rPr>
+        <w:t>the</w:t>
+      </w:r>
+      <w:r>
+        <w:rPr>
+          <w:lang w:val="en-GB"/>
+        </w:rPr>
+        <w:t xml:space="preserve"> execution.</w:t>
+      </w:r>
+    </w:p>
+    <w:p>
+      <w:pPr>
+        <w:rPr>
+          <w:lang w:val="en-GB"/>
+        </w:rPr>
+      </w:pPr>
+    </w:p>
+    <w:p>
+      <w:pPr>
+        <w:rPr>
+          <w:color w:val="00B0F0"/>
+          <w:sz w:val="23"/>
+          <w:szCs w:val="23"/>
+          <w:lang w:val="en-GB"/>
+        </w:rPr>
+      </w:pPr>
+      <w:r>
+        <w:rPr>
+          <w:lang w:val="en-GB"/>
+        </w:rPr>
+        <w:t>Through</w:t>
+      </w:r>
+      <w:r>
+        <w:rPr>
+          <w:lang w:val="en-GB"/>
+        </w:rPr>
+        <w:t xml:space="preserve"> providing verified references, a thorough risk analysis, and a systematic project roadmap, we, </w:t>
+      </w:r>
+      <w:r>
+        <w:rPr>
+          <w:b/>
+          <w:i/>
+          <w:lang w:val="en-GB"/>
+        </w:rPr>
+        <w:t>The Ripple Effect</w:t>
+      </w:r>
+      <w:r>
+        <w:rPr>
+          <w:lang w:val="en-GB"/>
+        </w:rPr>
+        <w:t xml:space="preserve">, aim to give all </w:t>
+      </w:r>
+      <w:r>
+        <w:rPr>
+          <w:lang w:val="en-GB"/>
+        </w:rPr>
+        <w:t xml:space="preserve">our </w:t>
+      </w:r>
+      <w:r>
+        <w:rPr>
+          <w:lang w:val="en-GB"/>
+        </w:rPr>
+        <w:t xml:space="preserve">stakeholders the information needed to support the development and implementation of </w:t>
+      </w:r>
+      <w:r>
+        <w:rPr>
+          <w:i/>
+          <w:lang w:val="en-GB"/>
+        </w:rPr>
+        <w:t>SplashScreen</w:t>
+      </w:r>
+      <w:r>
+        <w:rPr>
+          <w:lang w:val="en-GB"/>
+        </w:rPr>
+        <w:t xml:space="preserve">. This </w:t>
+      </w:r>
+      <w:r>
+        <w:rPr>
+          <w:lang w:val="en-GB"/>
+        </w:rPr>
+        <w:t>is</w:t>
+      </w:r>
+      <w:r>
+        <w:rPr>
+          <w:lang w:val="en-GB"/>
+        </w:rPr>
+        <w:t xml:space="preserve"> </w:t>
+      </w:r>
+      <w:r>
+        <w:rPr>
+          <w:lang w:val="en-GB"/>
+        </w:rPr>
+        <w:t>our</w:t>
+      </w:r>
+      <w:r>
+        <w:rPr>
+          <w:lang w:val="en-GB"/>
+        </w:rPr>
+        <w:t xml:space="preserve"> foundational blueprint, justifying the project's viability and demonstrating a clear path forward.</w:t>
       </w:r>
     </w:p>
     <w:p>
@@ -379,7 +563,15 @@
         <w:rPr>
           <w:lang w:val="en-GB"/>
         </w:rPr>
-        <w:t xml:space="preserve"> is quite popular due to the co</w:t>
+        <w:t xml:space="preserve"> is quite popular due to t</w:t>
+      </w:r>
+      <w:bookmarkStart w:id="0" w:name="_GoBack"/>
+      <w:bookmarkEnd w:id="0"/>
+      <w:r>
+        <w:rPr>
+          <w:lang w:val="en-GB"/>
+        </w:rPr>
+        <w:t>he co</w:t>
       </w:r>
       <w:r>
         <w:rPr>
@@ -415,7 +607,19 @@
         <w:rPr>
           <w:lang w:val="en-GB"/>
         </w:rPr>
-        <w:t>enge for both private homeowners and commercial facilities such as gums, hotels</w:t>
+        <w:t xml:space="preserve">enge for both private homeowners and commercial facilities such </w:t>
+      </w:r>
+      <w:r>
+        <w:rPr>
+          <w:lang w:val="en-GB"/>
+        </w:rPr>
+        <w:t>as</w:t>
+      </w:r>
+      <w:r>
+        <w:rPr>
+          <w:lang w:val="en-GB"/>
+        </w:rPr>
+        <w:t xml:space="preserve"> hotels</w:t>
       </w:r>
       <w:r>
         <w:rPr>
@@ -640,6 +844,7 @@
           <w:color w:val="00B0F0"/>
           <w:lang w:val="en-GB"/>
         </w:rPr>
+        <w:lastRenderedPageBreak/>
         <w:t xml:space="preserve">In this section you should list </w:t>
       </w:r>
       <w:r>
@@ -772,11 +977,7 @@
         <w:t xml:space="preserve"> is designed to be a meaningful intervention in the lives of South African pool owners and the dedicated professionals who serve them. </w:t>
       </w:r>
       <w:r>
-        <w:t xml:space="preserve">The primary goal of </w:t>
-      </w:r>
-      <w:r>
-        <w:lastRenderedPageBreak/>
-        <w:t>managing pools more effectively can be dissected into multiple, specific sub-problems.</w:t>
+        <w:t>The primary goal of managing pools more effectively can be dissected into multiple, specific sub-problems.</w:t>
       </w:r>
       <w:r>
         <w:t xml:space="preserve"> </w:t>
@@ -1522,365 +1723,336 @@
           <w:color w:val="00B0F0"/>
           <w:lang w:val="en-GB"/>
         </w:rPr>
-        <w:t xml:space="preserve">This is the literature review section of the document.  </w:t>
+        <w:t>This is the literature review section of the document.  In order for reader to better understand the problem, this section must provide an overview of the problem area using existing sources, e.g. web references, conference papers, white papers, patents or journal articles.  You are required to use proper APA referencing.  The idea with this section is that if a reader has no knowledge of the real-world problem area; this section should provide them enough background to understand the issue, e.g. an overview of the process that healthcare workers use when visiting patients in remote areas.</w:t>
+      </w:r>
+    </w:p>
+    <w:p>
+      <w:pPr>
+        <w:jc w:val="both"/>
+        <w:rPr>
+          <w:lang w:val="en-GB"/>
+        </w:rPr>
+      </w:pPr>
+    </w:p>
+    <w:p>
+      <w:pPr>
+        <w:spacing w:after="200" w:line="276" w:lineRule="auto"/>
+      </w:pPr>
+      <w:r>
+        <w:t xml:space="preserve">South Africa is a water-scarce country. National and international climate datasets describe South Africa as semi-dry with an average annual rainfall of roughly 464 mm, almost half the global average, a structural constraint that heightens drought risk and pressures domestic water use </w:t>
+      </w:r>
+      <w:r>
+        <w:rPr>
+          <w:i/>
+          <w:iCs/>
+        </w:rPr>
+        <w:t>(South African Government, n.d.; World Bank, n.d.)</w:t>
+      </w:r>
+      <w:r>
+        <w:t xml:space="preserve">. Research in Cape Town reveals that household water use is highly unequal, with the wealthiest +/-14% of residents consuming over half of the municipal water, much of it for non-essential purposes such as filling pools and irrigating gardens </w:t>
+      </w:r>
+      <w:r>
+        <w:t xml:space="preserve">(Savelli, 2023, as reported by </w:t>
+      </w:r>
+      <w:r>
+        <w:rPr>
+          <w:i/>
+          <w:iCs/>
+        </w:rPr>
+        <w:t>The Washington Post</w:t>
+      </w:r>
+      <w:r>
+        <w:t xml:space="preserve"> and </w:t>
+      </w:r>
+      <w:r>
+        <w:rPr>
+          <w:i/>
+          <w:iCs/>
+        </w:rPr>
+        <w:t>The Guardian</w:t>
+      </w:r>
+      <w:r>
+        <w:t>)</w:t>
+      </w:r>
+      <w:r>
+        <w:rPr>
+          <w:i/>
+          <w:iCs/>
+        </w:rPr>
+        <w:t>.</w:t>
+      </w:r>
+      <w:r>
+        <w:t xml:space="preserve"> </w:t>
+      </w:r>
+    </w:p>
+    <w:p>
+      <w:pPr>
+        <w:spacing w:after="200" w:line="276" w:lineRule="auto"/>
+      </w:pPr>
+      <w:r>
+        <w:t xml:space="preserve">Private swimming pools use a lot of water in South African suburbs. There are an estimated 800,000 private pools in the country, which is high compared to other places. This figure comes from marketing sources but matches older engineering estimates of about 700,000 pool pumps in use in 2010. </w:t>
+      </w:r>
+      <w:r>
+        <w:rPr>
+          <w:i/>
+          <w:iCs/>
+        </w:rPr>
+        <w:t>(</w:t>
+      </w:r>
+      <w:proofErr w:type="spellStart"/>
+      <w:r>
+        <w:rPr>
+          <w:i/>
+          <w:iCs/>
+        </w:rPr>
+        <w:t>Econsultancy</w:t>
+      </w:r>
+      <w:proofErr w:type="spellEnd"/>
+      <w:r>
+        <w:rPr>
+          <w:i/>
+          <w:iCs/>
+        </w:rPr>
+        <w:t>, 2022; Wuppertal Institute, 2015</w:t>
+      </w:r>
+      <w:r>
+        <w:rPr>
+          <w:i/>
+          <w:iCs/>
+        </w:rPr>
+        <w:t>)</w:t>
+      </w:r>
+      <w:r>
+        <w:t xml:space="preserve"> Studies in Cape Town confirm that homes with pools use more water, based on research across thousands of households</w:t>
+      </w:r>
+      <w:r>
+        <w:rPr>
+          <w:i/>
+          <w:iCs/>
+        </w:rPr>
+        <w:t>. (</w:t>
+      </w:r>
+      <w:proofErr w:type="spellStart"/>
+      <w:r>
+        <w:rPr>
+          <w:i/>
+          <w:iCs/>
+        </w:rPr>
+        <w:t>Musango</w:t>
+      </w:r>
+      <w:proofErr w:type="spellEnd"/>
+      <w:r>
+        <w:rPr>
+          <w:i/>
+          <w:iCs/>
+        </w:rPr>
+        <w:t xml:space="preserve"> &amp; Peter, 2012; Du Plessis &amp; Jacobs, 2015</w:t>
+      </w:r>
+      <w:r>
+        <w:rPr>
+          <w:i/>
+          <w:iCs/>
+        </w:rPr>
+        <w:t>)</w:t>
+      </w:r>
+    </w:p>
+    <w:p>
+      <w:pPr>
+        <w:spacing w:after="200" w:line="276" w:lineRule="auto"/>
+      </w:pPr>
+      <w:r>
+        <w:t xml:space="preserve">In South African metros, municipal restrictions during droughts often target discretionary uses. For example, the City of Cape Town’s restrictions historically required non-permeable covers for topping up and limited filling from municipal supply, reflecting policy levers that directly affect pool owners and service providers. Water scarcity policies further complicate maintenance. Many municipalities impose restrictions on topping up pools, particularly during droughts, limiting owners’ ability to dilute concentrated chemicals or replace evaporated water </w:t>
+      </w:r>
+      <w:r>
+        <w:rPr>
+          <w:i/>
+          <w:iCs/>
+        </w:rPr>
+        <w:t>(Department of Water and Sanitation [DWS], 2023)</w:t>
+      </w:r>
+      <w:r>
+        <w:t>. Not being able to adhere to these regulations not only wastes water but can also lead to financial penalties or fines.</w:t>
+      </w:r>
+    </w:p>
+    <w:p>
+      <w:pPr>
+        <w:spacing w:after="200" w:line="276" w:lineRule="auto"/>
+        <w:rPr>
+          <w:i/>
+          <w:iCs/>
+        </w:rPr>
+      </w:pPr>
+      <w:r>
+        <w:t xml:space="preserve">Unreliable electricity is a challenge in South Africa. Load shedding interrupts pool pump schedules, which affects water circulation and disinfection. This can cause algae to grow and strain equipment when the power comes back. Pool pumps also use a lot of electricity. Each </w:t>
+      </w:r>
+      <w:r>
+        <w:lastRenderedPageBreak/>
+        <w:t xml:space="preserve">pump uses about 2,600 kWh per year, adding up to around 1.84 TWh nationwide. </w:t>
+      </w:r>
+      <w:r>
+        <w:t>(</w:t>
+      </w:r>
+      <w:r>
+        <w:rPr>
+          <w:i/>
+          <w:iCs/>
+        </w:rPr>
+        <w:t>Wuppertal Institute, 2015</w:t>
+      </w:r>
+      <w:r>
+        <w:rPr>
+          <w:i/>
+          <w:iCs/>
+        </w:rPr>
+        <w:t>)</w:t>
+      </w:r>
+      <w:r>
+        <w:rPr>
+          <w:i/>
+          <w:iCs/>
+        </w:rPr>
+        <w:t xml:space="preserve">. </w:t>
+      </w:r>
+      <w:r>
+        <w:t xml:space="preserve"> Making pumps more efficient can save money and ease pressure on the power grid. Load shedding also reduces chemical distribution, allowing contaminants to accumulate. If pumps are not restarted promptly or properly after power is restored, water quality deteriorates, increasing the risk of pathogen growth such as E. coli and Cryptosporidium, which are harmful to swimmers </w:t>
+      </w:r>
+      <w:r>
+        <w:rPr>
+          <w:i/>
+          <w:iCs/>
+        </w:rPr>
+        <w:t>(</w:t>
+      </w:r>
+      <w:proofErr w:type="spellStart"/>
+      <w:r>
+        <w:rPr>
+          <w:i/>
+          <w:iCs/>
+        </w:rPr>
+        <w:t>Centers</w:t>
+      </w:r>
+      <w:proofErr w:type="spellEnd"/>
+      <w:r>
+        <w:rPr>
+          <w:i/>
+          <w:iCs/>
+        </w:rPr>
+        <w:t xml:space="preserve"> for Disease Control and Prevention, 2024</w:t>
+      </w:r>
+      <w:r>
+        <w:rPr>
+          <w:i/>
+          <w:iCs/>
+        </w:rPr>
+        <w:t xml:space="preserve">). </w:t>
+      </w:r>
+    </w:p>
+    <w:p>
+      <w:pPr>
+        <w:spacing w:after="200" w:line="276" w:lineRule="auto"/>
+        <w:rPr>
+          <w:i/>
+          <w:iCs/>
+        </w:rPr>
+      </w:pPr>
+      <w:r>
+        <w:t xml:space="preserve">The health and safety dimension requires a disciplined approach to water chemistry. International public-health guidance, used globally by operators and many residential guides, recommends maintaining free chlorine at 1-2+ ppm depending on cyanuric acid and pH between 7.0-7.8 to control pathogens and protect bathers and equipment, reinforcing the value of guided testing, calculators, and reminders for non-expert users </w:t>
+      </w:r>
+      <w:r>
+        <w:rPr>
+          <w:i/>
+          <w:iCs/>
+        </w:rPr>
+        <w:t>(</w:t>
+      </w:r>
+      <w:proofErr w:type="spellStart"/>
+      <w:r>
+        <w:rPr>
+          <w:i/>
+          <w:iCs/>
+        </w:rPr>
+        <w:t>Centers</w:t>
+      </w:r>
+      <w:proofErr w:type="spellEnd"/>
+      <w:r>
+        <w:rPr>
+          <w:i/>
+          <w:iCs/>
+        </w:rPr>
+        <w:t xml:space="preserve"> for Disease Control and Prevention, 2024). </w:t>
+      </w:r>
+    </w:p>
+    <w:p>
+      <w:pPr>
+        <w:spacing w:after="200" w:line="276" w:lineRule="auto"/>
+      </w:pPr>
+      <w:r>
+        <w:t>New pool owners are often surprised by how technical pool maintenance can be. To keep water safe, you need to check pH, chlorine, alkalinity, and calcium hardness regularly. These steps help stop germs from spreading, protect your equipment, and keep swimming safe. For instance, if the pH is not between 7.2 and 7.8, chlorine is less effective, algae can grow, and pumps or metal parts might corrode.</w:t>
+      </w:r>
+    </w:p>
+    <w:p>
+      <w:pPr>
+        <w:spacing w:after="200" w:line="276" w:lineRule="auto"/>
+      </w:pPr>
+      <w:r>
+        <w:t xml:space="preserve">Most pool owners find it hard to figure out how much of each chemical to use, especially if their pool size changes or they add water often. Small mistakes, like missing a chlorine dose or not checking pH, can quickly turn into bigger problems. Algae is an obvious sign of poor maintenance. It makes the water green and cloudy, clogs filters, requires more cleaning, and can even damage pool </w:t>
       </w:r>
       <w:proofErr w:type="gramStart"/>
       <w:r>
-        <w:rPr>
-          <w:color w:val="00B0F0"/>
-          <w:lang w:val="en-GB"/>
-        </w:rPr>
-        <w:t>In order for</w:t>
+        <w:t>surfaces</w:t>
       </w:r>
       <w:proofErr w:type="gramEnd"/>
       <w:r>
-        <w:rPr>
-          <w:color w:val="00B0F0"/>
-          <w:lang w:val="en-GB"/>
-        </w:rPr>
-        <w:t xml:space="preserve"> reader to better understand the problem, this section must provide an overview of the problem area using existing sources, e.g. web references, conference papers, white papers, patents or journal articles.  </w:t>
-      </w:r>
-      <w:r>
-        <w:rPr>
-          <w:color w:val="00B0F0"/>
-          <w:lang w:val="en-GB"/>
-        </w:rPr>
+        <w:t xml:space="preserve"> over time.</w:t>
+      </w:r>
+    </w:p>
+    <w:p>
+      <w:pPr>
+        <w:spacing w:after="200" w:line="276" w:lineRule="auto"/>
+      </w:pPr>
+      <w:r>
+        <w:t>Not knowing enough about pool care can also lead to equipment damage and extra costs. Using too much chlorine can corrode pumps, heaters, and liners. Too little chlorine lets algae and bacteria grow, which means you might need more chemicals or professional help. These problems show that poor pool maintenance can waste water, increase costs, create safety risks, and damage pools. That’s why clear guidance and simple maintenance systems matter.</w:t>
+      </w:r>
+    </w:p>
+    <w:p>
+      <w:pPr>
+        <w:spacing w:after="200" w:line="276" w:lineRule="auto"/>
+      </w:pPr>
+      <w:r>
+        <w:t>In South Africa, pool maintenance usually happens in two ways. Homeowners do it themselves or hire professionals. Both options depend on getting the right chemicals, equipment, and services like cleaning or repairs. But the market for these products and services is very scattered.</w:t>
+      </w:r>
+    </w:p>
+    <w:p>
+      <w:pPr>
+        <w:spacing w:after="200" w:line="276" w:lineRule="auto"/>
+      </w:pPr>
+      <w:r>
+        <w:t xml:space="preserve">Homeowners often struggle to find reliable suppliers or service providers. There are company websites, Facebook Marketplace, local directories, and small business apps, but these are all separate, so people have to search and check providers themselves. There is not much transparency, prices vary, and it’s hard to know if the service will be good. </w:t>
+      </w:r>
+    </w:p>
+    <w:p>
+      <w:pPr>
+        <w:spacing w:after="200" w:line="276" w:lineRule="auto"/>
+      </w:pPr>
+      <w:r>
         <w:lastRenderedPageBreak/>
-        <w:t>You are required to use proper APA referencing.  The idea with this section is that if a reader has no knowledge of the real-world problem area; this section should provide them enough background to understand the issue, e.g. an overview of the process that healthcare workers use when visiting patients in remote areas.</w:t>
-      </w:r>
-    </w:p>
-    <w:p>
-      <w:pPr>
-        <w:jc w:val="both"/>
-        <w:rPr>
-          <w:lang w:val="en-GB"/>
-        </w:rPr>
-      </w:pPr>
+        <w:t xml:space="preserve">The problem is not that there aren’t enough pool maintenance options, but that they are spread out. In South Africa, </w:t>
+      </w:r>
+      <w:bookmarkStart w:id="1" w:name="_Hlk207023184"/>
+      <w:r>
+        <w:t>there isn’t one platform that covers everything, from DIY water testing and advice to booking trusted service providers. A digital, all-in-one solution would help homeowners track chemical levels, plan maintenance, and book professionals easily. For businesses, it would provide a clear marketplace, help them find more customers, and make managing work and supplies simpler.</w:t>
+      </w:r>
+      <w:bookmarkEnd w:id="1"/>
     </w:p>
     <w:p>
       <w:pPr>
         <w:spacing w:after="200" w:line="276" w:lineRule="auto"/>
-      </w:pPr>
-      <w:r>
-        <w:t xml:space="preserve">South Africa is a water-scarce country. National and international climate datasets describe South Africa as semi-dry with an average annual rainfall of roughly 464 mm, almost half the global average, a structural constraint that heightens drought risk and pressures domestic water use </w:t>
-      </w:r>
-      <w:r>
         <w:rPr>
           <w:i/>
           <w:iCs/>
         </w:rPr>
-        <w:t>(South African Government, n.d.; World Bank, n.d.)</w:t>
-      </w:r>
-      <w:r>
-        <w:t xml:space="preserve">. Research in Cape Town reveals that household water use is highly unequal, with the wealthiest +/-14% of residents consuming over half of the municipal water, much of it for non-essential purposes such as filling pools and irrigating gardens </w:t>
-      </w:r>
-      <w:r>
-        <w:t xml:space="preserve">(Savelli, 2023, as reported by </w:t>
-      </w:r>
-      <w:r>
-        <w:rPr>
-          <w:i/>
-          <w:iCs/>
-        </w:rPr>
-        <w:t>The Washington Post</w:t>
-      </w:r>
-      <w:r>
-        <w:t xml:space="preserve"> and </w:t>
-      </w:r>
-      <w:r>
-        <w:rPr>
-          <w:i/>
-          <w:iCs/>
-        </w:rPr>
-        <w:t>The Guardian</w:t>
-      </w:r>
-      <w:r>
-        <w:t>)</w:t>
-      </w:r>
-      <w:r>
-        <w:rPr>
-          <w:i/>
-          <w:iCs/>
-        </w:rPr>
-        <w:t>.</w:t>
-      </w:r>
-      <w:r>
-        <w:t xml:space="preserve"> </w:t>
-      </w:r>
-    </w:p>
-    <w:p>
-      <w:pPr>
-        <w:spacing w:after="200" w:line="276" w:lineRule="auto"/>
-      </w:pPr>
-      <w:r>
-        <w:t xml:space="preserve">Private swimming pools use a lot of water in South African suburbs. There are an estimated 800,000 private pools in the country, which is high compared to other places. This figure comes from marketing sources but matches older engineering estimates of about 700,000 pool pumps in use in 2010. </w:t>
-      </w:r>
-      <w:r>
-        <w:rPr>
-          <w:i/>
-          <w:iCs/>
-        </w:rPr>
-        <w:t>(</w:t>
-      </w:r>
-      <w:proofErr w:type="spellStart"/>
-      <w:r>
-        <w:rPr>
-          <w:i/>
-          <w:iCs/>
-        </w:rPr>
-        <w:t>Econsultancy</w:t>
-      </w:r>
-      <w:proofErr w:type="spellEnd"/>
-      <w:r>
-        <w:rPr>
-          <w:i/>
-          <w:iCs/>
-        </w:rPr>
-        <w:t>, 2022; Wuppertal Institute, 2015</w:t>
-      </w:r>
-      <w:r>
-        <w:rPr>
-          <w:i/>
-          <w:iCs/>
-        </w:rPr>
-        <w:t>)</w:t>
-      </w:r>
-      <w:r>
-        <w:t xml:space="preserve"> Studies in Cape Town confirm that homes with pools use more water, based on research across thousands of households</w:t>
-      </w:r>
-      <w:r>
-        <w:rPr>
-          <w:i/>
-          <w:iCs/>
-        </w:rPr>
-        <w:t>. (</w:t>
-      </w:r>
-      <w:proofErr w:type="spellStart"/>
-      <w:r>
-        <w:rPr>
-          <w:i/>
-          <w:iCs/>
-        </w:rPr>
-        <w:t>Musango</w:t>
-      </w:r>
-      <w:proofErr w:type="spellEnd"/>
-      <w:r>
-        <w:rPr>
-          <w:i/>
-          <w:iCs/>
-        </w:rPr>
-        <w:t xml:space="preserve"> &amp; Peter, 2012; Du Plessis &amp; Jacobs, 2015</w:t>
-      </w:r>
-      <w:r>
-        <w:rPr>
-          <w:i/>
-          <w:iCs/>
-        </w:rPr>
-        <w:t>)</w:t>
-      </w:r>
-    </w:p>
-    <w:p>
-      <w:pPr>
-        <w:spacing w:after="200" w:line="276" w:lineRule="auto"/>
-      </w:pPr>
-      <w:r>
-        <w:t xml:space="preserve">In South African metros, municipal restrictions during droughts often target discretionary uses. For example, the City of Cape Town’s restrictions historically required non-permeable covers for topping up and limited filling from municipal supply, reflecting policy levers that directly affect pool owners and service providers. Water scarcity policies further complicate maintenance. Many municipalities impose restrictions on topping up pools, particularly during droughts, limiting owners’ ability to dilute concentrated chemicals or replace evaporated water </w:t>
-      </w:r>
-      <w:r>
-        <w:rPr>
-          <w:i/>
-          <w:iCs/>
-        </w:rPr>
-        <w:t>(Department of Water and Sanitation [DWS], 2023)</w:t>
-      </w:r>
-      <w:r>
-        <w:t>. Not being able to adhere to these regulations not only wastes water but can also lead to financial penalties or fines.</w:t>
-      </w:r>
-    </w:p>
-    <w:p>
-      <w:pPr>
-        <w:spacing w:after="200" w:line="276" w:lineRule="auto"/>
-        <w:rPr>
-          <w:i/>
-          <w:iCs/>
-        </w:rPr>
-      </w:pPr>
-      <w:r>
-        <w:t xml:space="preserve">Unreliable electricity is a challenge in South Africa. Load shedding interrupts pool pump schedules, which affects water circulation and disinfection. This can cause algae to grow and strain equipment when the power comes back. Pool pumps also use a lot of electricity. Each pump uses about 2,600 kWh per year, adding up to around 1.84 TWh nationwide. </w:t>
-      </w:r>
-      <w:r>
-        <w:t>(</w:t>
-      </w:r>
-      <w:r>
-        <w:rPr>
-          <w:i/>
-          <w:iCs/>
-        </w:rPr>
-        <w:t>Wuppertal Institute, 2015</w:t>
-      </w:r>
-      <w:r>
-        <w:rPr>
-          <w:i/>
-          <w:iCs/>
-        </w:rPr>
-        <w:t>)</w:t>
-      </w:r>
-      <w:r>
-        <w:rPr>
-          <w:i/>
-          <w:iCs/>
-        </w:rPr>
-        <w:t xml:space="preserve">. </w:t>
-      </w:r>
-      <w:r>
-        <w:t xml:space="preserve"> Making pumps more efficient can save money and ease pressure on the power grid. Load shedding also reduces chemical distribution, allowing contaminants to accumulate. If pumps are not restarted promptly or properly after power is restored, water quality deteriorates, increasing the risk of pathogen growth such as E. coli and Cryptosporidium, which are harmful to swimmers </w:t>
-      </w:r>
-      <w:r>
-        <w:rPr>
-          <w:i/>
-          <w:iCs/>
-        </w:rPr>
-        <w:t>(</w:t>
-      </w:r>
-      <w:proofErr w:type="spellStart"/>
-      <w:r>
-        <w:rPr>
-          <w:i/>
-          <w:iCs/>
-        </w:rPr>
-        <w:t>Centers</w:t>
-      </w:r>
-      <w:proofErr w:type="spellEnd"/>
-      <w:r>
-        <w:rPr>
-          <w:i/>
-          <w:iCs/>
-        </w:rPr>
-        <w:t xml:space="preserve"> for Disease Control and Prevention, 2024</w:t>
-      </w:r>
-      <w:r>
-        <w:rPr>
-          <w:i/>
-          <w:iCs/>
-        </w:rPr>
-        <w:t xml:space="preserve">). </w:t>
-      </w:r>
-    </w:p>
-    <w:p>
-      <w:pPr>
-        <w:spacing w:after="200" w:line="276" w:lineRule="auto"/>
-        <w:rPr>
-          <w:i/>
-          <w:iCs/>
-        </w:rPr>
-      </w:pPr>
-      <w:r>
-        <w:lastRenderedPageBreak/>
-        <w:t xml:space="preserve">The health and safety dimension requires a disciplined approach to water chemistry. International public-health guidance, used globally by operators and many residential guides, recommends maintaining free chlorine at 1-2+ ppm depending on cyanuric acid and pH between 7.0-7.8 to control pathogens and protect bathers and equipment, reinforcing the value of guided testing, calculators, and reminders for non-expert users </w:t>
-      </w:r>
-      <w:r>
-        <w:rPr>
-          <w:i/>
-          <w:iCs/>
-        </w:rPr>
-        <w:t>(</w:t>
-      </w:r>
-      <w:proofErr w:type="spellStart"/>
-      <w:r>
-        <w:rPr>
-          <w:i/>
-          <w:iCs/>
-        </w:rPr>
-        <w:t>Centers</w:t>
-      </w:r>
-      <w:proofErr w:type="spellEnd"/>
-      <w:r>
-        <w:rPr>
-          <w:i/>
-          <w:iCs/>
-        </w:rPr>
-        <w:t xml:space="preserve"> for Disease Control and Prevention, 2024). </w:t>
-      </w:r>
-    </w:p>
-    <w:p>
-      <w:pPr>
-        <w:spacing w:after="200" w:line="276" w:lineRule="auto"/>
-      </w:pPr>
-      <w:r>
-        <w:t>New pool owners are often surprised by how technical pool maintenance can be. To keep water safe, you need to check pH, chlorine, alkalinity, and calcium hardness regularly. These steps help stop germs from spreading, protect your equipment, and keep swimming safe. For instance, if the pH is not between 7.2 and 7.8, chlorine is less effective, algae can grow, and pumps or metal parts might corrode.</w:t>
-      </w:r>
-    </w:p>
-    <w:p>
-      <w:pPr>
-        <w:spacing w:after="200" w:line="276" w:lineRule="auto"/>
-      </w:pPr>
-      <w:r>
-        <w:t xml:space="preserve">Most pool owners find it hard to figure out how much of each chemical to use, especially if their pool size changes or they add water often. Small mistakes, like missing a chlorine dose or not checking pH, can quickly turn into bigger problems. Algae is an obvious sign of poor maintenance. It makes the water green and cloudy, clogs </w:t>
-      </w:r>
-      <w:proofErr w:type="gramStart"/>
-      <w:r>
-        <w:t>filters</w:t>
-      </w:r>
-      <w:proofErr w:type="gramEnd"/>
-      <w:r>
-        <w:t>, requires more cleaning, and can even damage pool surfaces over time.</w:t>
-      </w:r>
-    </w:p>
-    <w:p>
-      <w:pPr>
-        <w:spacing w:after="200" w:line="276" w:lineRule="auto"/>
-      </w:pPr>
-      <w:r>
-        <w:t>Not knowing enough about pool care can also lead to equipment damage and extra costs. Using too much chlorine can corrode pumps, heaters, and liners. Too little chlorine lets algae and bacteria grow, which means you might need more chemicals or professional help. These problems show that poor pool maintenance can waste water, increase costs, create safety risks, and damage pools. That’s why clear guidance and simple maintenance systems matter.</w:t>
-      </w:r>
-    </w:p>
-    <w:p>
-      <w:pPr>
-        <w:spacing w:after="200" w:line="276" w:lineRule="auto"/>
-      </w:pPr>
-      <w:r>
-        <w:t>In South Africa, pool maintenance usually happens in two ways. Homeowners do it themselves or hire professionals. Both options depend on getting the right chemicals, equipment, and services like cleaning or repairs. But the market for these products and services is very scattered.</w:t>
-      </w:r>
-    </w:p>
-    <w:p>
-      <w:pPr>
-        <w:spacing w:after="200" w:line="276" w:lineRule="auto"/>
-      </w:pPr>
-      <w:r>
-        <w:t xml:space="preserve">Homeowners often struggle to find reliable suppliers or service providers. There are company websites, Facebook Marketplace, local directories, and small business apps, but these are all separate, so people </w:t>
-      </w:r>
-      <w:proofErr w:type="gramStart"/>
-      <w:r>
-        <w:t>have to</w:t>
-      </w:r>
-      <w:proofErr w:type="gramEnd"/>
-      <w:r>
-        <w:t xml:space="preserve"> search and check providers themselves. There is not much transparency, prices vary, and it’s hard to know if the service will be good. </w:t>
-      </w:r>
-    </w:p>
-    <w:p>
-      <w:pPr>
-        <w:spacing w:after="200" w:line="276" w:lineRule="auto"/>
-      </w:pPr>
-      <w:r>
-        <w:t xml:space="preserve">The problem is not that there aren’t enough pool maintenance options, but that they are spread out. In South Africa, </w:t>
-      </w:r>
-      <w:bookmarkStart w:id="0" w:name="_Hlk207023184"/>
-      <w:r>
-        <w:t>there isn’t one platform that covers everything, from DIY water testing and advice to booking trusted service providers. A digital, all-in-one solution would help homeowners track chemical levels, plan maintenance, and book professionals easily. For businesses, it would provide a clear marketplace, help them find more customers, and make managing work and supplies simpler.</w:t>
-      </w:r>
-      <w:bookmarkEnd w:id="0"/>
-    </w:p>
-    <w:p>
-      <w:pPr>
-        <w:spacing w:after="200" w:line="276" w:lineRule="auto"/>
-        <w:rPr>
-          <w:i/>
-          <w:iCs/>
-        </w:rPr>
-      </w:pPr>
-      <w:r>
-        <w:lastRenderedPageBreak/>
+      </w:pPr>
+      <w:r>
         <w:t xml:space="preserve">By combining these elements, such a system could address multiple local challenges simultaneously, including reducing water and chemical waste, lowering operational costs, improving compliance with municipal regulations, and ensuring consistent, reliable service. This aligns with global trends in digital service marketplaces, which demonstrate that centralized platforms improve both user experience and business efficiency </w:t>
       </w:r>
       <w:r>
@@ -2272,7 +2444,7 @@
           </mc:Choice>
           <mc:Fallback>
             <w:pict>
-              <v:group w14:anchorId="33451930" id="Group 3" o:spid="_x0000_s1026" style="width:428.3pt;height:335.5pt;mso-position-horizontal-relative:char;mso-position-vertical-relative:line" coordsize="57277,45269" o:gfxdata="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">
+              <v:group w14:anchorId="33451930" id="Group 3" o:spid="_x0000_s1026" style="width:428.3pt;height:335.5pt;mso-position-horizontal-relative:char;mso-position-vertical-relative:line" coordsize="57277,45269" o:gfxdata="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">
                 <v:shapetype id="_x0000_t75" coordsize="21600,21600" o:spt="75" o:preferrelative="t" path="m@4@5l@4@11@9@11@9@5xe" filled="f" stroked="f">
                   <v:stroke joinstyle="miter"/>
                   <v:formulas>
@@ -6516,18 +6688,8 @@
           <w:color w:val="auto"/>
           <w:lang w:val="en-ZA"/>
         </w:rPr>
-        <w:t xml:space="preserve">Tinotenda </w:t>
-      </w:r>
-      <w:proofErr w:type="spellStart"/>
-      <w:r>
-        <w:rPr>
-          <w:rFonts w:asciiTheme="minorHAnsi" w:hAnsiTheme="minorHAnsi"/>
-          <w:color w:val="auto"/>
-          <w:lang w:val="en-ZA"/>
-        </w:rPr>
-        <w:t>Mhedziso</w:t>
-      </w:r>
-      <w:proofErr w:type="spellEnd"/>
+        <w:t>Tinotenda Mhedziso</w:t>
+      </w:r>
       <w:r>
         <w:rPr>
           <w:rFonts w:asciiTheme="minorHAnsi" w:hAnsiTheme="minorHAnsi"/>
@@ -7081,6 +7243,7 @@
         </w:rPr>
         <w:t xml:space="preserve">based on 2 factors: client satisfaction and </w:t>
       </w:r>
+      <w:proofErr w:type="gramStart"/>
       <w:r>
         <w:rPr>
           <w:rFonts w:asciiTheme="minorHAnsi" w:hAnsiTheme="minorHAnsi"/>
@@ -7106,16 +7269,17 @@
           <w:color w:val="auto"/>
           <w:lang w:val="en-GB"/>
         </w:rPr>
-        <w:t>execution</w:t>
-      </w:r>
-      <w:r>
-        <w:rPr>
-          <w:rFonts w:asciiTheme="minorHAnsi" w:hAnsiTheme="minorHAnsi"/>
-          <w:iCs/>
-          <w:color w:val="auto"/>
-          <w:lang w:val="en-GB"/>
-        </w:rPr>
-        <w:t xml:space="preserve">. </w:t>
+        <w:t>.</w:t>
+      </w:r>
+      <w:proofErr w:type="gramEnd"/>
+      <w:r>
+        <w:rPr>
+          <w:rFonts w:asciiTheme="minorHAnsi" w:hAnsiTheme="minorHAnsi"/>
+          <w:iCs/>
+          <w:color w:val="auto"/>
+          <w:lang w:val="en-GB"/>
+        </w:rPr>
+        <w:t xml:space="preserve"> </w:t>
       </w:r>
       <w:r>
         <w:rPr>
@@ -7133,7 +7297,7 @@
           <w:color w:val="auto"/>
           <w:lang w:val="en-GB"/>
         </w:rPr>
-        <w:t xml:space="preserve">e will be completing bi-weekly reviews with our client through </w:t>
+        <w:t xml:space="preserve">e will be completing bi-weekly reviews with our client through sharing our </w:t>
       </w:r>
       <w:r>
         <w:rPr>
@@ -7143,7 +7307,7 @@
           <w:lang w:val="en-GB"/>
         </w:rPr>
         <w:lastRenderedPageBreak/>
-        <w:t xml:space="preserve">sharing our current documentation and collecting responses from </w:t>
+        <w:t xml:space="preserve">current documentation and collecting responses from </w:t>
       </w:r>
       <w:r>
         <w:rPr>
@@ -7747,21 +7911,7 @@
         <w:rPr>
           <w:lang w:val="en-GB"/>
         </w:rPr>
-        <w:t xml:space="preserve">. This is </w:t>
-      </w:r>
-      <w:proofErr w:type="gramStart"/>
-      <w:r>
-        <w:rPr>
-          <w:lang w:val="en-GB"/>
-        </w:rPr>
-        <w:t>similar to</w:t>
-      </w:r>
-      <w:proofErr w:type="gramEnd"/>
-      <w:r>
-        <w:rPr>
-          <w:lang w:val="en-GB"/>
-        </w:rPr>
-        <w:t xml:space="preserve"> other Gantt chart features present by project management tools such as </w:t>
+        <w:t xml:space="preserve">. This is similar to other Gantt chart features present by project management tools such as </w:t>
       </w:r>
       <w:proofErr w:type="spellStart"/>
       <w:r>
@@ -8331,25 +8481,7 @@
           <w:color w:val="00B0F0"/>
           <w:lang w:val="en-GB"/>
         </w:rPr>
-        <w:t xml:space="preserve">There are many models, which are used to identify different risks. But we will not go into specific ones here. In general, we can say that to categorise risks can help in the process. You will quickly discover that you need to limit yourself regarding risks during a brainstorming activity. Otherwise, the list of events and conditions can become very long. You need to assess how likely it is that the </w:t>
-      </w:r>
-      <w:proofErr w:type="gramStart"/>
-      <w:r>
-        <w:rPr>
-          <w:rFonts w:asciiTheme="minorHAnsi" w:hAnsiTheme="minorHAnsi" w:cstheme="minorBidi"/>
-          <w:color w:val="00B0F0"/>
-          <w:lang w:val="en-GB"/>
-        </w:rPr>
-        <w:t>particular event</w:t>
-      </w:r>
-      <w:proofErr w:type="gramEnd"/>
-      <w:r>
-        <w:rPr>
-          <w:rFonts w:asciiTheme="minorHAnsi" w:hAnsiTheme="minorHAnsi" w:cstheme="minorBidi"/>
-          <w:color w:val="00B0F0"/>
-          <w:lang w:val="en-GB"/>
-        </w:rPr>
-        <w:t xml:space="preserve"> occurs. </w:t>
+        <w:t xml:space="preserve">There are many models, which are used to identify different risks. But we will not go into specific ones here. In general, we can say that to categorise risks can help in the process. You will quickly discover that you need to limit yourself regarding risks during a brainstorming activity. Otherwise, the list of events and conditions can become very long. You need to assess how likely it is that the particular event occurs. </w:t>
       </w:r>
       <w:r>
         <w:rPr>
@@ -8367,29 +8499,7 @@
           <w:color w:val="00B0F0"/>
           <w:lang w:val="en-GB"/>
         </w:rPr>
-        <w:t xml:space="preserve">The entire project could be ruined if a woman in labour runs across a road and a driver </w:t>
-      </w:r>
-      <w:proofErr w:type="gramStart"/>
-      <w:r>
-        <w:rPr>
-          <w:rFonts w:asciiTheme="minorHAnsi" w:hAnsiTheme="minorHAnsi" w:cstheme="minorBidi"/>
-          <w:i/>
-          <w:iCs/>
-          <w:color w:val="00B0F0"/>
-          <w:lang w:val="en-GB"/>
-        </w:rPr>
-        <w:t>has to</w:t>
-      </w:r>
-      <w:proofErr w:type="gramEnd"/>
-      <w:r>
-        <w:rPr>
-          <w:rFonts w:asciiTheme="minorHAnsi" w:hAnsiTheme="minorHAnsi" w:cstheme="minorBidi"/>
-          <w:i/>
-          <w:iCs/>
-          <w:color w:val="00B0F0"/>
-          <w:lang w:val="en-GB"/>
-        </w:rPr>
-        <w:t xml:space="preserve"> swerve to avoid her. The driver crashes into a bus and loses a wheel, which rolls across the road, pulls along a bag of dynamite, which was about to be used. The dynamite then explodes next to a lamppost, which shoots, like a rocket, through the window of the project teams office. The rocket hits the project leader in the head and the project leader, by mistake, deletes all the code, which has been written. The rocket continues through the office and finally lands on a shelf filled with super magnets, which then fall onto the server, which contains all the backups and removes them all.</w:t>
+        <w:t>The entire project could be ruined if a woman in labour runs across a road and a driver has to swerve to avoid her. The driver crashes into a bus and loses a wheel, which rolls across the road, pulls along a bag of dynamite, which was about to be used. The dynamite then explodes next to a lamppost, which shoots, like a rocket, through the window of the project teams office. The rocket hits the project leader in the head and the project leader, by mistake, deletes all the code, which has been written. The rocket continues through the office and finally lands on a shelf filled with super magnets, which then fall onto the server, which contains all the backups and removes them all.</w:t>
       </w:r>
       <w:r>
         <w:rPr>
@@ -8618,29 +8728,7 @@
           <w:color w:val="00B0F0"/>
           <w:lang w:val="en-GB"/>
         </w:rPr>
-        <w:t xml:space="preserve">Identify (at least) 4 risks to your project.  If you have time, add more, since the more you </w:t>
-      </w:r>
-      <w:proofErr w:type="gramStart"/>
-      <w:r>
-        <w:rPr>
-          <w:rFonts w:asciiTheme="minorHAnsi" w:hAnsiTheme="minorHAnsi" w:cstheme="minorBidi"/>
-          <w:i/>
-          <w:iCs/>
-          <w:color w:val="00B0F0"/>
-          <w:lang w:val="en-GB"/>
-        </w:rPr>
-        <w:t>are able to</w:t>
-      </w:r>
-      <w:proofErr w:type="gramEnd"/>
-      <w:r>
-        <w:rPr>
-          <w:rFonts w:asciiTheme="minorHAnsi" w:hAnsiTheme="minorHAnsi" w:cstheme="minorBidi"/>
-          <w:i/>
-          <w:iCs/>
-          <w:color w:val="00B0F0"/>
-          <w:lang w:val="en-GB"/>
-        </w:rPr>
-        <w:t xml:space="preserve"> identify at the start, the better you can plan for things to go wrong (and they usually do).  For each risk, state which type of risk it is and how you will treat/handle the risk.</w:t>
+        <w:t>Identify (at least) 4 risks to your project.  If you have time, add more, since the more you are able to identify at the start, the better you can plan for things to go wrong (and they usually do).  For each risk, state which type of risk it is and how you will treat/handle the risk.</w:t>
       </w:r>
     </w:p>
     <w:p>
@@ -9410,7 +9498,7 @@
 </file>
 
 <file path=word/endnotes.xml><?xml version="1.0" encoding="utf-8"?>
-<w:endnotes xmlns:wpc="http://schemas.microsoft.com/office/word/2010/wordprocessingCanvas" xmlns:cx="http://schemas.microsoft.com/office/drawing/2014/chartex" xmlns:cx1="http://schemas.microsoft.com/office/drawing/2015/9/8/chartex" xmlns:cx2="http://schemas.microsoft.com/office/drawing/2015/10/21/chartex" xmlns:cx3="http://schemas.microsoft.com/office/drawing/2016/5/9/chartex" xmlns:cx4="http://schemas.microsoft.com/office/drawing/2016/5/10/chartex" xmlns:cx5="http://schemas.microsoft.com/office/drawing/2016/5/11/chartex" xmlns:cx6="http://schemas.microsoft.com/office/drawing/2016/5/12/chartex" xmlns:cx7="http://schemas.microsoft.com/office/drawing/2016/5/13/chartex" xmlns:cx8="http://schemas.microsoft.com/office/drawing/2016/5/14/chartex" xmlns:mc="http://schemas.openxmlformats.org/markup-compatibility/2006" xmlns:aink="http://schemas.microsoft.com/office/drawing/2016/ink" xmlns:am3d="http://schemas.microsoft.com/office/drawing/2017/model3d" xmlns:o="urn:schemas-microsoft-com:office:office" xmlns:oel="http://schemas.microsoft.com/office/2019/extlst" xmlns:r="http://schemas.openxmlformats.org/officeDocument/2006/relationships" xmlns:m="http://schemas.openxmlformats.org/officeDocument/2006/math" xmlns:v="urn:schemas-microsoft-com:vml" xmlns:wp14="http://schemas.microsoft.com/office/word/2010/wordprocessingDrawing" xmlns:wp="http://schemas.openxmlformats.org/drawingml/2006/wordprocessingDrawing" xmlns:w10="urn:schemas-microsoft-com:office:word" xmlns:w="http://schemas.openxmlformats.org/wordprocessingml/2006/main" xmlns:w14="http://schemas.microsoft.com/office/word/2010/wordml" xmlns:w15="http://schemas.microsoft.com/office/word/2012/wordml" xmlns:w16cex="http://schemas.microsoft.com/office/word/2018/wordml/cex" xmlns:w16cid="http://schemas.microsoft.com/office/word/2016/wordml/cid" xmlns:w16="http://schemas.microsoft.com/office/word/2018/wordml" xmlns:w16du="http://schemas.microsoft.com/office/word/2023/wordml/word16du" xmlns:w16sdtdh="http://schemas.microsoft.com/office/word/2020/wordml/sdtdatahash" xmlns:w16sdtfl="http://schemas.microsoft.com/office/word/2024/wordml/sdtformatlock" xmlns:w16se="http://schemas.microsoft.com/office/word/2015/wordml/symex" xmlns:wpg="http://schemas.microsoft.com/office/word/2010/wordprocessingGroup" xmlns:wpi="http://schemas.microsoft.com/office/word/2010/wordprocessingInk" xmlns:wne="http://schemas.microsoft.com/office/word/2006/wordml" xmlns:wps="http://schemas.microsoft.com/office/word/2010/wordprocessingShape" mc:Ignorable="w14 w15 w16se w16cid w16 w16cex w16sdtdh w16sdtfl w16du wp14">
+<w:endnotes xmlns:wpc="http://schemas.microsoft.com/office/word/2010/wordprocessingCanvas" xmlns:cx="http://schemas.microsoft.com/office/drawing/2014/chartex" xmlns:cx1="http://schemas.microsoft.com/office/drawing/2015/9/8/chartex" xmlns:cx2="http://schemas.microsoft.com/office/drawing/2015/10/21/chartex" xmlns:cx3="http://schemas.microsoft.com/office/drawing/2016/5/9/chartex" xmlns:cx4="http://schemas.microsoft.com/office/drawing/2016/5/10/chartex" xmlns:cx5="http://schemas.microsoft.com/office/drawing/2016/5/11/chartex" xmlns:cx6="http://schemas.microsoft.com/office/drawing/2016/5/12/chartex" xmlns:cx7="http://schemas.microsoft.com/office/drawing/2016/5/13/chartex" xmlns:cx8="http://schemas.microsoft.com/office/drawing/2016/5/14/chartex" xmlns:mc="http://schemas.openxmlformats.org/markup-compatibility/2006" xmlns:aink="http://schemas.microsoft.com/office/drawing/2016/ink" xmlns:am3d="http://schemas.microsoft.com/office/drawing/2017/model3d" xmlns:o="urn:schemas-microsoft-com:office:office" xmlns:r="http://schemas.openxmlformats.org/officeDocument/2006/relationships" xmlns:m="http://schemas.openxmlformats.org/officeDocument/2006/math" xmlns:v="urn:schemas-microsoft-com:vml" xmlns:wp14="http://schemas.microsoft.com/office/word/2010/wordprocessingDrawing" xmlns:wp="http://schemas.openxmlformats.org/drawingml/2006/wordprocessingDrawing" xmlns:w10="urn:schemas-microsoft-com:office:word" xmlns:w="http://schemas.openxmlformats.org/wordprocessingml/2006/main" xmlns:w14="http://schemas.microsoft.com/office/word/2010/wordml" xmlns:w15="http://schemas.microsoft.com/office/word/2012/wordml" xmlns:w16cid="http://schemas.microsoft.com/office/word/2016/wordml/cid" xmlns:w16se="http://schemas.microsoft.com/office/word/2015/wordml/symex" xmlns:wpg="http://schemas.microsoft.com/office/word/2010/wordprocessingGroup" xmlns:wpi="http://schemas.microsoft.com/office/word/2010/wordprocessingInk" xmlns:wne="http://schemas.microsoft.com/office/word/2006/wordml" xmlns:wps="http://schemas.microsoft.com/office/word/2010/wordprocessingShape" mc:Ignorable="w14 w15 w16se w16cid wp14">
   <w:endnote w:type="separator" w:id="-1">
     <w:p>
       <w:r>
@@ -9429,7 +9517,7 @@
 </file>
 
 <file path=word/footnotes.xml><?xml version="1.0" encoding="utf-8"?>
-<w:footnotes xmlns:wpc="http://schemas.microsoft.com/office/word/2010/wordprocessingCanvas" xmlns:cx="http://schemas.microsoft.com/office/drawing/2014/chartex" xmlns:cx1="http://schemas.microsoft.com/office/drawing/2015/9/8/chartex" xmlns:cx2="http://schemas.microsoft.com/office/drawing/2015/10/21/chartex" xmlns:cx3="http://schemas.microsoft.com/office/drawing/2016/5/9/chartex" xmlns:cx4="http://schemas.microsoft.com/office/drawing/2016/5/10/chartex" xmlns:cx5="http://schemas.microsoft.com/office/drawing/2016/5/11/chartex" xmlns:cx6="http://schemas.microsoft.com/office/drawing/2016/5/12/chartex" xmlns:cx7="http://schemas.microsoft.com/office/drawing/2016/5/13/chartex" xmlns:cx8="http://schemas.microsoft.com/office/drawing/2016/5/14/chartex" xmlns:mc="http://schemas.openxmlformats.org/markup-compatibility/2006" xmlns:aink="http://schemas.microsoft.com/office/drawing/2016/ink" xmlns:am3d="http://schemas.microsoft.com/office/drawing/2017/model3d" xmlns:o="urn:schemas-microsoft-com:office:office" xmlns:oel="http://schemas.microsoft.com/office/2019/extlst" xmlns:r="http://schemas.openxmlformats.org/officeDocument/2006/relationships" xmlns:m="http://schemas.openxmlformats.org/officeDocument/2006/math" xmlns:v="urn:schemas-microsoft-com:vml" xmlns:wp14="http://schemas.microsoft.com/office/word/2010/wordprocessingDrawing" xmlns:wp="http://schemas.openxmlformats.org/drawingml/2006/wordprocessingDrawing" xmlns:w10="urn:schemas-microsoft-com:office:word" xmlns:w="http://schemas.openxmlformats.org/wordprocessingml/2006/main" xmlns:w14="http://schemas.microsoft.com/office/word/2010/wordml" xmlns:w15="http://schemas.microsoft.com/office/word/2012/wordml" xmlns:w16cex="http://schemas.microsoft.com/office/word/2018/wordml/cex" xmlns:w16cid="http://schemas.microsoft.com/office/word/2016/wordml/cid" xmlns:w16="http://schemas.microsoft.com/office/word/2018/wordml" xmlns:w16du="http://schemas.microsoft.com/office/word/2023/wordml/word16du" xmlns:w16sdtdh="http://schemas.microsoft.com/office/word/2020/wordml/sdtdatahash" xmlns:w16sdtfl="http://schemas.microsoft.com/office/word/2024/wordml/sdtformatlock" xmlns:w16se="http://schemas.microsoft.com/office/word/2015/wordml/symex" xmlns:wpg="http://schemas.microsoft.com/office/word/2010/wordprocessingGroup" xmlns:wpi="http://schemas.microsoft.com/office/word/2010/wordprocessingInk" xmlns:wne="http://schemas.microsoft.com/office/word/2006/wordml" xmlns:wps="http://schemas.microsoft.com/office/word/2010/wordprocessingShape" mc:Ignorable="w14 w15 w16se w16cid w16 w16cex w16sdtdh w16sdtfl w16du wp14">
+<w:footnotes xmlns:wpc="http://schemas.microsoft.com/office/word/2010/wordprocessingCanvas" xmlns:cx="http://schemas.microsoft.com/office/drawing/2014/chartex" xmlns:cx1="http://schemas.microsoft.com/office/drawing/2015/9/8/chartex" xmlns:cx2="http://schemas.microsoft.com/office/drawing/2015/10/21/chartex" xmlns:cx3="http://schemas.microsoft.com/office/drawing/2016/5/9/chartex" xmlns:cx4="http://schemas.microsoft.com/office/drawing/2016/5/10/chartex" xmlns:cx5="http://schemas.microsoft.com/office/drawing/2016/5/11/chartex" xmlns:cx6="http://schemas.microsoft.com/office/drawing/2016/5/12/chartex" xmlns:cx7="http://schemas.microsoft.com/office/drawing/2016/5/13/chartex" xmlns:cx8="http://schemas.microsoft.com/office/drawing/2016/5/14/chartex" xmlns:mc="http://schemas.openxmlformats.org/markup-compatibility/2006" xmlns:aink="http://schemas.microsoft.com/office/drawing/2016/ink" xmlns:am3d="http://schemas.microsoft.com/office/drawing/2017/model3d" xmlns:o="urn:schemas-microsoft-com:office:office" xmlns:r="http://schemas.openxmlformats.org/officeDocument/2006/relationships" xmlns:m="http://schemas.openxmlformats.org/officeDocument/2006/math" xmlns:v="urn:schemas-microsoft-com:vml" xmlns:wp14="http://schemas.microsoft.com/office/word/2010/wordprocessingDrawing" xmlns:wp="http://schemas.openxmlformats.org/drawingml/2006/wordprocessingDrawing" xmlns:w10="urn:schemas-microsoft-com:office:word" xmlns:w="http://schemas.openxmlformats.org/wordprocessingml/2006/main" xmlns:w14="http://schemas.microsoft.com/office/word/2010/wordml" xmlns:w15="http://schemas.microsoft.com/office/word/2012/wordml" xmlns:w16cid="http://schemas.microsoft.com/office/word/2016/wordml/cid" xmlns:w16se="http://schemas.microsoft.com/office/word/2015/wordml/symex" xmlns:wpg="http://schemas.microsoft.com/office/word/2010/wordprocessingGroup" xmlns:wpi="http://schemas.microsoft.com/office/word/2010/wordprocessingInk" xmlns:wne="http://schemas.microsoft.com/office/word/2006/wordml" xmlns:wps="http://schemas.microsoft.com/office/word/2010/wordprocessingShape" mc:Ignorable="w14 w15 w16se w16cid wp14">
   <w:footnote w:type="separator" w:id="-1">
     <w:p>
       <w:r>
@@ -9448,7 +9536,7 @@
 </file>
 
 <file path=word/numbering.xml><?xml version="1.0" encoding="utf-8"?>
-<w:numbering xmlns:wpc="http://schemas.microsoft.com/office/word/2010/wordprocessingCanvas" xmlns:cx="http://schemas.microsoft.com/office/drawing/2014/chartex" xmlns:cx1="http://schemas.microsoft.com/office/drawing/2015/9/8/chartex" xmlns:cx2="http://schemas.microsoft.com/office/drawing/2015/10/21/chartex" xmlns:cx3="http://schemas.microsoft.com/office/drawing/2016/5/9/chartex" xmlns:cx4="http://schemas.microsoft.com/office/drawing/2016/5/10/chartex" xmlns:cx5="http://schemas.microsoft.com/office/drawing/2016/5/11/chartex" xmlns:cx6="http://schemas.microsoft.com/office/drawing/2016/5/12/chartex" xmlns:cx7="http://schemas.microsoft.com/office/drawing/2016/5/13/chartex" xmlns:cx8="http://schemas.microsoft.com/office/drawing/2016/5/14/chartex" xmlns:mc="http://schemas.openxmlformats.org/markup-compatibility/2006" xmlns:aink="http://schemas.microsoft.com/office/drawing/2016/ink" xmlns:am3d="http://schemas.microsoft.com/office/drawing/2017/model3d" xmlns:o="urn:schemas-microsoft-com:office:office" xmlns:oel="http://schemas.microsoft.com/office/2019/extlst" xmlns:r="http://schemas.openxmlformats.org/officeDocument/2006/relationships" xmlns:m="http://schemas.openxmlformats.org/officeDocument/2006/math" xmlns:v="urn:schemas-microsoft-com:vml" xmlns:wp14="http://schemas.microsoft.com/office/word/2010/wordprocessingDrawing" xmlns:wp="http://schemas.openxmlformats.org/drawingml/2006/wordprocessingDrawing" xmlns:w10="urn:schemas-microsoft-com:office:word" xmlns:w="http://schemas.openxmlformats.org/wordprocessingml/2006/main" xmlns:w14="http://schemas.microsoft.com/office/word/2010/wordml" xmlns:w15="http://schemas.microsoft.com/office/word/2012/wordml" xmlns:w16cex="http://schemas.microsoft.com/office/word/2018/wordml/cex" xmlns:w16cid="http://schemas.microsoft.com/office/word/2016/wordml/cid" xmlns:w16="http://schemas.microsoft.com/office/word/2018/wordml" xmlns:w16du="http://schemas.microsoft.com/office/word/2023/wordml/word16du" xmlns:w16sdtdh="http://schemas.microsoft.com/office/word/2020/wordml/sdtdatahash" xmlns:w16sdtfl="http://schemas.microsoft.com/office/word/2024/wordml/sdtformatlock" xmlns:w16se="http://schemas.microsoft.com/office/word/2015/wordml/symex" xmlns:wpg="http://schemas.microsoft.com/office/word/2010/wordprocessingGroup" xmlns:wpi="http://schemas.microsoft.com/office/word/2010/wordprocessingInk" xmlns:wne="http://schemas.microsoft.com/office/word/2006/wordml" xmlns:wps="http://schemas.microsoft.com/office/word/2010/wordprocessingShape" mc:Ignorable="w14 w15 w16se w16cid w16 w16cex w16sdtdh w16sdtfl w16du wp14">
+<w:numbering xmlns:wpc="http://schemas.microsoft.com/office/word/2010/wordprocessingCanvas" xmlns:cx="http://schemas.microsoft.com/office/drawing/2014/chartex" xmlns:cx1="http://schemas.microsoft.com/office/drawing/2015/9/8/chartex" xmlns:cx2="http://schemas.microsoft.com/office/drawing/2015/10/21/chartex" xmlns:cx3="http://schemas.microsoft.com/office/drawing/2016/5/9/chartex" xmlns:cx4="http://schemas.microsoft.com/office/drawing/2016/5/10/chartex" xmlns:cx5="http://schemas.microsoft.com/office/drawing/2016/5/11/chartex" xmlns:cx6="http://schemas.microsoft.com/office/drawing/2016/5/12/chartex" xmlns:cx7="http://schemas.microsoft.com/office/drawing/2016/5/13/chartex" xmlns:cx8="http://schemas.microsoft.com/office/drawing/2016/5/14/chartex" xmlns:mc="http://schemas.openxmlformats.org/markup-compatibility/2006" xmlns:aink="http://schemas.microsoft.com/office/drawing/2016/ink" xmlns:am3d="http://schemas.microsoft.com/office/drawing/2017/model3d" xmlns:o="urn:schemas-microsoft-com:office:office" xmlns:r="http://schemas.openxmlformats.org/officeDocument/2006/relationships" xmlns:m="http://schemas.openxmlformats.org/officeDocument/2006/math" xmlns:v="urn:schemas-microsoft-com:vml" xmlns:wp14="http://schemas.microsoft.com/office/word/2010/wordprocessingDrawing" xmlns:wp="http://schemas.openxmlformats.org/drawingml/2006/wordprocessingDrawing" xmlns:w10="urn:schemas-microsoft-com:office:word" xmlns:w="http://schemas.openxmlformats.org/wordprocessingml/2006/main" xmlns:w14="http://schemas.microsoft.com/office/word/2010/wordml" xmlns:w15="http://schemas.microsoft.com/office/word/2012/wordml" xmlns:w16cid="http://schemas.microsoft.com/office/word/2016/wordml/cid" xmlns:w16se="http://schemas.microsoft.com/office/word/2015/wordml/symex" xmlns:wpg="http://schemas.microsoft.com/office/word/2010/wordprocessingGroup" xmlns:wpi="http://schemas.microsoft.com/office/word/2010/wordprocessingInk" xmlns:wne="http://schemas.microsoft.com/office/word/2006/wordml" xmlns:wps="http://schemas.microsoft.com/office/word/2010/wordprocessingShape" mc:Ignorable="w14 w15 w16se w16cid wp14">
   <w:abstractNum w:abstractNumId="0" w15:restartNumberingAfterBreak="0">
     <w:nsid w:val="028257A6"/>
     <w:multiLevelType w:val="hybridMultilevel"/>
@@ -10594,19 +10682,19 @@
       </w:rPr>
     </w:lvl>
   </w:abstractNum>
-  <w:num w:numId="1" w16cid:durableId="1250963855">
+  <w:num w:numId="1">
     <w:abstractNumId w:val="6"/>
   </w:num>
-  <w:num w:numId="2" w16cid:durableId="1978339430">
+  <w:num w:numId="2">
     <w:abstractNumId w:val="1"/>
   </w:num>
-  <w:num w:numId="3" w16cid:durableId="223496186">
+  <w:num w:numId="3">
     <w:abstractNumId w:val="7"/>
   </w:num>
-  <w:num w:numId="4" w16cid:durableId="1679843246">
+  <w:num w:numId="4">
     <w:abstractNumId w:val="9"/>
   </w:num>
-  <w:num w:numId="5" w16cid:durableId="1771856080">
+  <w:num w:numId="5">
     <w:abstractNumId w:val="9"/>
     <w:lvlOverride w:ilvl="0">
       <w:startOverride w:val="1"/>
@@ -10746,7 +10834,7 @@
       </w:lvl>
     </w:lvlOverride>
   </w:num>
-  <w:num w:numId="6" w16cid:durableId="943147470">
+  <w:num w:numId="6">
     <w:abstractNumId w:val="9"/>
     <w:lvlOverride w:ilvl="0">
       <w:startOverride w:val="1"/>
@@ -10886,7 +10974,7 @@
       </w:lvl>
     </w:lvlOverride>
   </w:num>
-  <w:num w:numId="7" w16cid:durableId="841549306">
+  <w:num w:numId="7">
     <w:abstractNumId w:val="9"/>
     <w:lvlOverride w:ilvl="0">
       <w:startOverride w:val="1"/>
@@ -11026,7 +11114,7 @@
       </w:lvl>
     </w:lvlOverride>
   </w:num>
-  <w:num w:numId="8" w16cid:durableId="238684668">
+  <w:num w:numId="8">
     <w:abstractNumId w:val="9"/>
     <w:lvlOverride w:ilvl="0">
       <w:startOverride w:val="1"/>
@@ -11166,29 +11254,29 @@
       </w:lvl>
     </w:lvlOverride>
   </w:num>
-  <w:num w:numId="9" w16cid:durableId="227230188">
+  <w:num w:numId="9">
     <w:abstractNumId w:val="3"/>
   </w:num>
-  <w:num w:numId="10" w16cid:durableId="1695570746">
+  <w:num w:numId="10">
     <w:abstractNumId w:val="8"/>
   </w:num>
-  <w:num w:numId="11" w16cid:durableId="46730270">
+  <w:num w:numId="11">
     <w:abstractNumId w:val="5"/>
   </w:num>
-  <w:num w:numId="12" w16cid:durableId="1658847583">
+  <w:num w:numId="12">
     <w:abstractNumId w:val="4"/>
   </w:num>
-  <w:num w:numId="13" w16cid:durableId="690643624">
+  <w:num w:numId="13">
     <w:abstractNumId w:val="0"/>
   </w:num>
-  <w:num w:numId="14" w16cid:durableId="1973246598">
+  <w:num w:numId="14">
     <w:abstractNumId w:val="2"/>
   </w:num>
 </w:numbering>
 </file>
 
 <file path=word/styles.xml><?xml version="1.0" encoding="utf-8"?>
-<w:styles xmlns:mc="http://schemas.openxmlformats.org/markup-compatibility/2006" xmlns:r="http://schemas.openxmlformats.org/officeDocument/2006/relationships" xmlns:w="http://schemas.openxmlformats.org/wordprocessingml/2006/main" xmlns:w14="http://schemas.microsoft.com/office/word/2010/wordml" xmlns:w15="http://schemas.microsoft.com/office/word/2012/wordml" xmlns:w16cex="http://schemas.microsoft.com/office/word/2018/wordml/cex" xmlns:w16cid="http://schemas.microsoft.com/office/word/2016/wordml/cid" xmlns:w16="http://schemas.microsoft.com/office/word/2018/wordml" xmlns:w16du="http://schemas.microsoft.com/office/word/2023/wordml/word16du" xmlns:w16sdtdh="http://schemas.microsoft.com/office/word/2020/wordml/sdtdatahash" xmlns:w16sdtfl="http://schemas.microsoft.com/office/word/2024/wordml/sdtformatlock" xmlns:w16se="http://schemas.microsoft.com/office/word/2015/wordml/symex" mc:Ignorable="w14 w15 w16se w16cid w16 w16cex w16sdtdh w16sdtfl w16du">
+<w:styles xmlns:mc="http://schemas.openxmlformats.org/markup-compatibility/2006" xmlns:r="http://schemas.openxmlformats.org/officeDocument/2006/relationships" xmlns:w="http://schemas.openxmlformats.org/wordprocessingml/2006/main" xmlns:w14="http://schemas.microsoft.com/office/word/2010/wordml" xmlns:w15="http://schemas.microsoft.com/office/word/2012/wordml" xmlns:w16cid="http://schemas.microsoft.com/office/word/2016/wordml/cid" xmlns:w16se="http://schemas.microsoft.com/office/word/2015/wordml/symex" mc:Ignorable="w14 w15 w16se w16cid">
   <w:docDefaults>
     <w:rPrDefault>
       <w:rPr>
@@ -11200,7 +11288,7 @@
     </w:rPrDefault>
     <w:pPrDefault/>
   </w:docDefaults>
-  <w:latentStyles w:defLockedState="0" w:defUIPriority="99" w:defSemiHidden="0" w:defUnhideWhenUsed="0" w:defQFormat="0" w:count="376">
+  <w:latentStyles w:defLockedState="0" w:defUIPriority="99" w:defSemiHidden="0" w:defUnhideWhenUsed="0" w:defQFormat="0" w:count="375">
     <w:lsdException w:name="Normal" w:uiPriority="0" w:qFormat="1"/>
     <w:lsdException w:name="heading 1" w:uiPriority="9" w:qFormat="1"/>
     <w:lsdException w:name="heading 2" w:semiHidden="1" w:uiPriority="9" w:unhideWhenUsed="1" w:qFormat="1"/>
@@ -11576,7 +11664,6 @@
     <w:lsdException w:name="Smart Hyperlink" w:semiHidden="1" w:unhideWhenUsed="1"/>
     <w:lsdException w:name="Hashtag" w:semiHidden="1" w:unhideWhenUsed="1"/>
     <w:lsdException w:name="Unresolved Mention" w:semiHidden="1" w:unhideWhenUsed="1"/>
-    <w:lsdException w:name="Smart Link" w:semiHidden="1" w:unhideWhenUsed="1"/>
   </w:latentStyles>
   <w:style w:type="paragraph" w:default="1" w:styleId="Normal">
     <w:name w:val="Normal"/>
@@ -12324,7 +12411,7 @@
 </file>
 
 <file path=customXml/itemProps1.xml><?xml version="1.0" encoding="utf-8"?>
-<ds:datastoreItem xmlns:ds="http://schemas.openxmlformats.org/officeDocument/2006/customXml" ds:itemID="{C974C3AF-D573-4189-970F-B145E7C0B661}">
+<ds:datastoreItem xmlns:ds="http://schemas.openxmlformats.org/officeDocument/2006/customXml" ds:itemID="{CE80EFA0-B2CA-4872-BBA1-1B01AE509719}">
   <ds:schemaRefs>
     <ds:schemaRef ds:uri="http://schemas.openxmlformats.org/officeDocument/2006/bibliography"/>
   </ds:schemaRefs>

</xml_diff>